<commit_message>
Conform data files + pipeline to ares-contract v1.0.0 (schemaVersion, content, META)
</commit_message>
<xml_diff>
--- a/data/outputs/docx/Grade 10 Bio/Bio 1.1/Biology_Introduction_CBE_LessonSequence.docx
+++ b/data/outputs/docx/Grade 10 Bio/Bio 1.1/Biology_Introduction_CBE_LessonSequence.docx
@@ -18,6 +18,7 @@
           <w:sz w:val="28"/>
           <w:szCs w:val="28"/>
         </w:rPr>
+        <w:t xml:space="preserve">BIOLOGY GRADE 10: INTRODUCTION TO BIOLOGY</w:t>
       </w:r>
     </w:p>
     <w:p>
@@ -36,6 +37,7 @@
           <w:sz w:val="22"/>
           <w:szCs w:val="22"/>
         </w:rPr>
+        <w:t xml:space="preserve">CBE Phenomenon-Driven Lesson Sequence - Sub-Strand 1.1 (6 Lessons)</w:t>
       </w:r>
     </w:p>
     <w:p>
@@ -3111,11 +3113,11 @@
       </w:tblPr>
       <w:tblGrid>
         <w:gridCol w:w="900"/>
+        <w:gridCol w:w="2300"/>
         <w:gridCol w:w="2556"/>
-        <w:gridCol w:w="2556"/>
-        <w:gridCol w:w="2556"/>
-        <w:gridCol w:w="2556"/>
-        <w:gridCol w:w="2556"/>
+        <w:gridCol w:w="3324"/>
+        <w:gridCol w:w="2300"/>
+        <w:gridCol w:w="2300"/>
       </w:tblGrid>
       <w:tr>
         <w:tc>
@@ -3187,7 +3189,7 @@
         </w:tc>
         <w:tc>
           <w:tcPr>
-            <w:tcW w:type="dxa" w:w="2556"/>
+            <w:tcW w:type="dxa" w:w="2300"/>
             <w:shd w:fill="2E75B6" w:color="auto" w:val="clear"/>
             <w:tcMar>
               <w:top w:type="dxa" w:w="60"/>
@@ -3251,7 +3253,7 @@
         </w:tc>
         <w:tc>
           <w:tcPr>
-            <w:tcW w:type="dxa" w:w="2556"/>
+            <w:tcW w:type="dxa" w:w="3324"/>
             <w:shd w:fill="2E75B6" w:color="auto" w:val="clear"/>
             <w:tcMar>
               <w:top w:type="dxa" w:w="60"/>
@@ -3283,7 +3285,7 @@
         </w:tc>
         <w:tc>
           <w:tcPr>
-            <w:tcW w:type="dxa" w:w="2556"/>
+            <w:tcW w:type="dxa" w:w="2300"/>
             <w:shd w:fill="1F6B75" w:color="auto" w:val="clear"/>
             <w:tcMar>
               <w:top w:type="dxa" w:w="60"/>
@@ -3315,7 +3317,7 @@
         </w:tc>
         <w:tc>
           <w:tcPr>
-            <w:tcW w:type="dxa" w:w="2556"/>
+            <w:tcW w:type="dxa" w:w="2300"/>
             <w:shd w:fill="2E75B6" w:color="auto" w:val="clear"/>
             <w:tcMar>
               <w:top w:type="dxa" w:w="60"/>
@@ -3381,7 +3383,7 @@
         </w:tc>
         <w:tc>
           <w:tcPr>
-            <w:tcW w:type="dxa" w:w="2556"/>
+            <w:tcW w:type="dxa" w:w="2300"/>
             <w:shd w:fill="FFFFFF" w:color="auto" w:val="clear"/>
             <w:tcMar>
               <w:top w:type="dxa" w:w="60"/>
@@ -3443,7 +3445,7 @@
             <w:pPr>
               <w:spacing w:after="20" w:before="0"/>
             </w:pPr>
-            <w:hyperlink w:history="1" r:id="rIdk4c6kjgazgm6-hjnbkmt5">
+            <w:hyperlink w:history="1" r:id="rId75u4rl8sr9cou3oeyxrzw">
               <w:r>
                 <w:rPr>
                   <w:rFonts w:ascii="Arial" w:cs="Arial" w:eastAsia="Arial" w:hAnsi="Arial"/>
@@ -3476,7 +3478,7 @@
               <w:spacing w:after="10" w:before="0"/>
               <w:ind w:left="120"/>
             </w:pPr>
-            <w:hyperlink w:history="1" r:id="rId061_30kqo1qvl_eoibhks">
+            <w:hyperlink w:history="1" r:id="rIdeg3etec0i1aoco_9irlfn">
               <w:r>
                 <w:rPr>
                   <w:rFonts w:ascii="Arial" w:cs="Arial" w:eastAsia="Arial" w:hAnsi="Arial"/>
@@ -3521,7 +3523,7 @@
             <w:pPr>
               <w:spacing w:after="20" w:before="0"/>
             </w:pPr>
-            <w:hyperlink w:history="1" r:id="rIdvawagbqba1avzyxhqzp-r">
+            <w:hyperlink w:history="1" r:id="rIdu2rliwm71r-twmgt4brhy">
               <w:r>
                 <w:rPr>
                   <w:rFonts w:ascii="Arial" w:cs="Arial" w:eastAsia="Arial" w:hAnsi="Arial"/>
@@ -3554,7 +3556,7 @@
               <w:spacing w:after="10" w:before="0"/>
               <w:ind w:left="120"/>
             </w:pPr>
-            <w:hyperlink w:history="1" r:id="rId56oasvckbu3awxxeesgxj">
+            <w:hyperlink w:history="1" r:id="rIdxqphn2wslp9trbyetml_f">
               <w:r>
                 <w:rPr>
                   <w:rFonts w:ascii="Arial" w:cs="Arial" w:eastAsia="Arial" w:hAnsi="Arial"/>
@@ -3570,7 +3572,7 @@
         </w:tc>
         <w:tc>
           <w:tcPr>
-            <w:tcW w:type="dxa" w:w="2556"/>
+            <w:tcW w:type="dxa" w:w="3324"/>
             <w:shd w:fill="FFFFFF" w:color="auto" w:val="clear"/>
             <w:tcMar>
               <w:top w:type="dxa" w:w="60"/>
@@ -3659,7 +3661,7 @@
         </w:tc>
         <w:tc>
           <w:tcPr>
-            <w:tcW w:type="dxa" w:w="2556"/>
+            <w:tcW w:type="dxa" w:w="2300"/>
             <w:shd w:fill="F2F2F2" w:color="auto" w:val="clear"/>
             <w:tcMar>
               <w:top w:type="dxa" w:w="60"/>
@@ -3710,7 +3712,7 @@
         </w:tc>
         <w:tc>
           <w:tcPr>
-            <w:tcW w:type="dxa" w:w="2556"/>
+            <w:tcW w:type="dxa" w:w="2300"/>
             <w:shd w:fill="FFFFFF" w:color="auto" w:val="clear"/>
             <w:tcMar>
               <w:top w:type="dxa" w:w="60"/>
@@ -3795,7 +3797,7 @@
         </w:tc>
         <w:tc>
           <w:tcPr>
-            <w:tcW w:type="dxa" w:w="2556"/>
+            <w:tcW w:type="dxa" w:w="2300"/>
             <w:shd w:fill="FFFFFF" w:color="auto" w:val="clear"/>
             <w:tcMar>
               <w:top w:type="dxa" w:w="60"/>
@@ -3857,7 +3859,7 @@
             <w:pPr>
               <w:spacing w:after="20" w:before="0"/>
             </w:pPr>
-            <w:hyperlink w:history="1" r:id="rIdvw7zjriifwtotqvqz9-ha">
+            <w:hyperlink w:history="1" r:id="rIdek9qf22ga3z3p1wrfkfn0">
               <w:r>
                 <w:rPr>
                   <w:rFonts w:ascii="Arial" w:cs="Arial" w:eastAsia="Arial" w:hAnsi="Arial"/>
@@ -3890,7 +3892,7 @@
               <w:spacing w:after="10" w:before="0"/>
               <w:ind w:left="120"/>
             </w:pPr>
-            <w:hyperlink w:history="1" r:id="rIdmdaxlmpvookemlqdbfu3v">
+            <w:hyperlink w:history="1" r:id="rIdourdqfokmnb5prvn87ozr">
               <w:r>
                 <w:rPr>
                   <w:rFonts w:ascii="Arial" w:cs="Arial" w:eastAsia="Arial" w:hAnsi="Arial"/>
@@ -3935,7 +3937,7 @@
             <w:pPr>
               <w:spacing w:after="20" w:before="0"/>
             </w:pPr>
-            <w:hyperlink w:history="1" r:id="rIdi69w4jtmbn4s_tbo4t1qk">
+            <w:hyperlink w:history="1" r:id="rIdrvnrb6b_dnwrfl048jgek">
               <w:r>
                 <w:rPr>
                   <w:rFonts w:ascii="Arial" w:cs="Arial" w:eastAsia="Arial" w:hAnsi="Arial"/>
@@ -3968,7 +3970,7 @@
               <w:spacing w:after="10" w:before="0"/>
               <w:ind w:left="120"/>
             </w:pPr>
-            <w:hyperlink w:history="1" r:id="rIdbsftdjhwjif67-2tey2b8">
+            <w:hyperlink w:history="1" r:id="rIdrcspb3mh_adqovuf5bwcm">
               <w:r>
                 <w:rPr>
                   <w:rFonts w:ascii="Arial" w:cs="Arial" w:eastAsia="Arial" w:hAnsi="Arial"/>
@@ -3984,7 +3986,7 @@
         </w:tc>
         <w:tc>
           <w:tcPr>
-            <w:tcW w:type="dxa" w:w="2556"/>
+            <w:tcW w:type="dxa" w:w="3324"/>
             <w:shd w:fill="FFFFFF" w:color="auto" w:val="clear"/>
             <w:tcMar>
               <w:top w:type="dxa" w:w="60"/>
@@ -4073,7 +4075,7 @@
         </w:tc>
         <w:tc>
           <w:tcPr>
-            <w:tcW w:type="dxa" w:w="2556"/>
+            <w:tcW w:type="dxa" w:w="2300"/>
             <w:shd w:fill="F2F2F2" w:color="auto" w:val="clear"/>
             <w:tcMar>
               <w:top w:type="dxa" w:w="60"/>
@@ -4124,7 +4126,7 @@
         </w:tc>
         <w:tc>
           <w:tcPr>
-            <w:tcW w:type="dxa" w:w="2556"/>
+            <w:tcW w:type="dxa" w:w="2300"/>
             <w:shd w:fill="FFFFFF" w:color="auto" w:val="clear"/>
             <w:tcMar>
               <w:top w:type="dxa" w:w="60"/>
@@ -4209,7 +4211,7 @@
         </w:tc>
         <w:tc>
           <w:tcPr>
-            <w:tcW w:type="dxa" w:w="2556"/>
+            <w:tcW w:type="dxa" w:w="2300"/>
             <w:shd w:fill="FFFFFF" w:color="auto" w:val="clear"/>
             <w:tcMar>
               <w:top w:type="dxa" w:w="60"/>
@@ -4271,7 +4273,7 @@
             <w:pPr>
               <w:spacing w:after="20" w:before="0"/>
             </w:pPr>
-            <w:hyperlink w:history="1" r:id="rIdq8i9cerroykhm3fzodbc1">
+            <w:hyperlink w:history="1" r:id="rIdlu64mbaa6ilhyaf3dgbv0">
               <w:r>
                 <w:rPr>
                   <w:rFonts w:ascii="Arial" w:cs="Arial" w:eastAsia="Arial" w:hAnsi="Arial"/>
@@ -4304,7 +4306,7 @@
               <w:spacing w:after="10" w:before="0"/>
               <w:ind w:left="120"/>
             </w:pPr>
-            <w:hyperlink w:history="1" r:id="rIdau8wx7jltnji8-vg1xbzi">
+            <w:hyperlink w:history="1" r:id="rIdmeonuaxm0zxvtxkg8-xg7">
               <w:r>
                 <w:rPr>
                   <w:rFonts w:ascii="Arial" w:cs="Arial" w:eastAsia="Arial" w:hAnsi="Arial"/>
@@ -4349,7 +4351,7 @@
             <w:pPr>
               <w:spacing w:after="20" w:before="0"/>
             </w:pPr>
-            <w:hyperlink w:history="1" r:id="rIdj1stmhlka1xytsw3peybg">
+            <w:hyperlink w:history="1" r:id="rIdpyqjvdeeh3whfh6e_zvuv">
               <w:r>
                 <w:rPr>
                   <w:rFonts w:ascii="Arial" w:cs="Arial" w:eastAsia="Arial" w:hAnsi="Arial"/>
@@ -4382,7 +4384,7 @@
               <w:spacing w:after="10" w:before="0"/>
               <w:ind w:left="120"/>
             </w:pPr>
-            <w:hyperlink w:history="1" r:id="rId7hjq0zjup6z0ipokxvlxk">
+            <w:hyperlink w:history="1" r:id="rIdrbjbpowdi_p2qkcxfwxks">
               <w:r>
                 <w:rPr>
                   <w:rFonts w:ascii="Arial" w:cs="Arial" w:eastAsia="Arial" w:hAnsi="Arial"/>
@@ -4398,7 +4400,7 @@
         </w:tc>
         <w:tc>
           <w:tcPr>
-            <w:tcW w:type="dxa" w:w="2556"/>
+            <w:tcW w:type="dxa" w:w="3324"/>
             <w:shd w:fill="FFFFFF" w:color="auto" w:val="clear"/>
             <w:tcMar>
               <w:top w:type="dxa" w:w="60"/>
@@ -4487,7 +4489,7 @@
         </w:tc>
         <w:tc>
           <w:tcPr>
-            <w:tcW w:type="dxa" w:w="2556"/>
+            <w:tcW w:type="dxa" w:w="2300"/>
             <w:shd w:fill="F2F2F2" w:color="auto" w:val="clear"/>
             <w:tcMar>
               <w:top w:type="dxa" w:w="60"/>
@@ -4538,7 +4540,7 @@
         </w:tc>
         <w:tc>
           <w:tcPr>
-            <w:tcW w:type="dxa" w:w="2556"/>
+            <w:tcW w:type="dxa" w:w="2300"/>
             <w:shd w:fill="FFFFFF" w:color="auto" w:val="clear"/>
             <w:tcMar>
               <w:top w:type="dxa" w:w="60"/>
@@ -4604,7 +4606,7 @@
         </w:tc>
         <w:tc>
           <w:tcPr>
-            <w:tcW w:type="dxa" w:w="2556"/>
+            <w:tcW w:type="dxa" w:w="2300"/>
             <w:shd w:fill="FFFFFF" w:color="auto" w:val="clear"/>
             <w:tcMar>
               <w:top w:type="dxa" w:w="60"/>
@@ -4666,7 +4668,7 @@
             <w:pPr>
               <w:spacing w:after="20" w:before="0"/>
             </w:pPr>
-            <w:hyperlink w:history="1" r:id="rIdysvvjbdcrwkkfrduzk2qk">
+            <w:hyperlink w:history="1" r:id="rIdfee_s9kpbbu2j0smrqiqj">
               <w:r>
                 <w:rPr>
                   <w:rFonts w:ascii="Arial" w:cs="Arial" w:eastAsia="Arial" w:hAnsi="Arial"/>
@@ -4699,7 +4701,7 @@
               <w:spacing w:after="10" w:before="0"/>
               <w:ind w:left="120"/>
             </w:pPr>
-            <w:hyperlink w:history="1" r:id="rIdyxtcvodtajxzom3syts99">
+            <w:hyperlink w:history="1" r:id="rIdtzxcy29jb-ht5chdejhlc">
               <w:r>
                 <w:rPr>
                   <w:rFonts w:ascii="Arial" w:cs="Arial" w:eastAsia="Arial" w:hAnsi="Arial"/>
@@ -4744,7 +4746,7 @@
             <w:pPr>
               <w:spacing w:after="20" w:before="0"/>
             </w:pPr>
-            <w:hyperlink w:history="1" r:id="rIdaf8lequzd7ira-wxiiwez">
+            <w:hyperlink w:history="1" r:id="rIdwm5251ypm0cuv73l2zrnt">
               <w:r>
                 <w:rPr>
                   <w:rFonts w:ascii="Arial" w:cs="Arial" w:eastAsia="Arial" w:hAnsi="Arial"/>
@@ -4777,7 +4779,7 @@
               <w:spacing w:after="10" w:before="0"/>
               <w:ind w:left="120"/>
             </w:pPr>
-            <w:hyperlink w:history="1" r:id="rId-rjaf4tlv_yyb7ujcxofe">
+            <w:hyperlink w:history="1" r:id="rIdk9p5y3skx__mpzoqrgkgx">
               <w:r>
                 <w:rPr>
                   <w:rFonts w:ascii="Arial" w:cs="Arial" w:eastAsia="Arial" w:hAnsi="Arial"/>
@@ -4793,7 +4795,7 @@
         </w:tc>
         <w:tc>
           <w:tcPr>
-            <w:tcW w:type="dxa" w:w="2556"/>
+            <w:tcW w:type="dxa" w:w="3324"/>
             <w:shd w:fill="FFFFFF" w:color="auto" w:val="clear"/>
             <w:tcMar>
               <w:top w:type="dxa" w:w="60"/>
@@ -4882,7 +4884,7 @@
         </w:tc>
         <w:tc>
           <w:tcPr>
-            <w:tcW w:type="dxa" w:w="2556"/>
+            <w:tcW w:type="dxa" w:w="2300"/>
             <w:shd w:fill="F2F2F2" w:color="auto" w:val="clear"/>
             <w:tcMar>
               <w:top w:type="dxa" w:w="60"/>
@@ -4933,7 +4935,7 @@
         </w:tc>
         <w:tc>
           <w:tcPr>
-            <w:tcW w:type="dxa" w:w="2556"/>
+            <w:tcW w:type="dxa" w:w="2300"/>
             <w:shd w:fill="FFFFFF" w:color="auto" w:val="clear"/>
             <w:tcMar>
               <w:top w:type="dxa" w:w="60"/>
@@ -5037,7 +5039,7 @@
         </w:tc>
         <w:tc>
           <w:tcPr>
-            <w:tcW w:type="dxa" w:w="2556"/>
+            <w:tcW w:type="dxa" w:w="2300"/>
             <w:shd w:fill="FFFFFF" w:color="auto" w:val="clear"/>
             <w:tcMar>
               <w:top w:type="dxa" w:w="60"/>
@@ -5099,7 +5101,7 @@
             <w:pPr>
               <w:spacing w:after="20" w:before="0"/>
             </w:pPr>
-            <w:hyperlink w:history="1" r:id="rIdjehzhmnfyujkevvmdyisw">
+            <w:hyperlink w:history="1" r:id="rIdg-6aeyij1rih3yiqhjf_q">
               <w:r>
                 <w:rPr>
                   <w:rFonts w:ascii="Arial" w:cs="Arial" w:eastAsia="Arial" w:hAnsi="Arial"/>
@@ -5132,7 +5134,7 @@
               <w:spacing w:after="10" w:before="0"/>
               <w:ind w:left="120"/>
             </w:pPr>
-            <w:hyperlink w:history="1" r:id="rIdeicu8lufnbgwz2wnkqnl9">
+            <w:hyperlink w:history="1" r:id="rId382lgft_j1t6dh-pltu-y">
               <w:r>
                 <w:rPr>
                   <w:rFonts w:ascii="Arial" w:cs="Arial" w:eastAsia="Arial" w:hAnsi="Arial"/>
@@ -5177,7 +5179,7 @@
             <w:pPr>
               <w:spacing w:after="20" w:before="0"/>
             </w:pPr>
-            <w:hyperlink w:history="1" r:id="rId-lud64wodrulkfwxnu9y-">
+            <w:hyperlink w:history="1" r:id="rIdefdrsql6yk-fzxgoayymu">
               <w:r>
                 <w:rPr>
                   <w:rFonts w:ascii="Arial" w:cs="Arial" w:eastAsia="Arial" w:hAnsi="Arial"/>
@@ -5210,7 +5212,7 @@
               <w:spacing w:after="10" w:before="0"/>
               <w:ind w:left="120"/>
             </w:pPr>
-            <w:hyperlink w:history="1" r:id="rIdo9f8jwikqhxwtun3iq2ex">
+            <w:hyperlink w:history="1" r:id="rIdsxjjwtgwt9ckt2vu9ysie">
               <w:r>
                 <w:rPr>
                   <w:rFonts w:ascii="Arial" w:cs="Arial" w:eastAsia="Arial" w:hAnsi="Arial"/>
@@ -5226,7 +5228,7 @@
         </w:tc>
         <w:tc>
           <w:tcPr>
-            <w:tcW w:type="dxa" w:w="2556"/>
+            <w:tcW w:type="dxa" w:w="3324"/>
             <w:shd w:fill="FFFFFF" w:color="auto" w:val="clear"/>
             <w:tcMar>
               <w:top w:type="dxa" w:w="60"/>
@@ -5296,7 +5298,7 @@
         </w:tc>
         <w:tc>
           <w:tcPr>
-            <w:tcW w:type="dxa" w:w="2556"/>
+            <w:tcW w:type="dxa" w:w="2300"/>
             <w:shd w:fill="F2F2F2" w:color="auto" w:val="clear"/>
             <w:tcMar>
               <w:top w:type="dxa" w:w="60"/>
@@ -5347,7 +5349,7 @@
         </w:tc>
         <w:tc>
           <w:tcPr>
-            <w:tcW w:type="dxa" w:w="2556"/>
+            <w:tcW w:type="dxa" w:w="2300"/>
             <w:shd w:fill="FFFFFF" w:color="auto" w:val="clear"/>
             <w:tcMar>
               <w:top w:type="dxa" w:w="60"/>
@@ -6887,11 +6889,11 @@
       </w:tblPr>
       <w:tblGrid>
         <w:gridCol w:w="900"/>
+        <w:gridCol w:w="2300"/>
         <w:gridCol w:w="2556"/>
-        <w:gridCol w:w="2556"/>
-        <w:gridCol w:w="2556"/>
-        <w:gridCol w:w="2556"/>
-        <w:gridCol w:w="2556"/>
+        <w:gridCol w:w="3324"/>
+        <w:gridCol w:w="2300"/>
+        <w:gridCol w:w="2300"/>
       </w:tblGrid>
       <w:tr>
         <w:tc>
@@ -6963,7 +6965,7 @@
         </w:tc>
         <w:tc>
           <w:tcPr>
-            <w:tcW w:type="dxa" w:w="2556"/>
+            <w:tcW w:type="dxa" w:w="2300"/>
             <w:shd w:fill="2E75B6" w:color="auto" w:val="clear"/>
             <w:tcMar>
               <w:top w:type="dxa" w:w="60"/>
@@ -7027,7 +7029,7 @@
         </w:tc>
         <w:tc>
           <w:tcPr>
-            <w:tcW w:type="dxa" w:w="2556"/>
+            <w:tcW w:type="dxa" w:w="3324"/>
             <w:shd w:fill="2E75B6" w:color="auto" w:val="clear"/>
             <w:tcMar>
               <w:top w:type="dxa" w:w="60"/>
@@ -7059,7 +7061,7 @@
         </w:tc>
         <w:tc>
           <w:tcPr>
-            <w:tcW w:type="dxa" w:w="2556"/>
+            <w:tcW w:type="dxa" w:w="2300"/>
             <w:shd w:fill="1F6B75" w:color="auto" w:val="clear"/>
             <w:tcMar>
               <w:top w:type="dxa" w:w="60"/>
@@ -7091,7 +7093,7 @@
         </w:tc>
         <w:tc>
           <w:tcPr>
-            <w:tcW w:type="dxa" w:w="2556"/>
+            <w:tcW w:type="dxa" w:w="2300"/>
             <w:shd w:fill="2E75B6" w:color="auto" w:val="clear"/>
             <w:tcMar>
               <w:top w:type="dxa" w:w="60"/>
@@ -7157,7 +7159,7 @@
         </w:tc>
         <w:tc>
           <w:tcPr>
-            <w:tcW w:type="dxa" w:w="2556"/>
+            <w:tcW w:type="dxa" w:w="2300"/>
             <w:shd w:fill="FFFFFF" w:color="auto" w:val="clear"/>
             <w:tcMar>
               <w:top w:type="dxa" w:w="60"/>
@@ -7219,7 +7221,7 @@
             <w:pPr>
               <w:spacing w:after="20" w:before="0"/>
             </w:pPr>
-            <w:hyperlink w:history="1" r:id="rIdwm8ekfezwk9_hkfdxttoe">
+            <w:hyperlink w:history="1" r:id="rId3bqprx7_k1bzfv4bgwzok">
               <w:r>
                 <w:rPr>
                   <w:rFonts w:ascii="Arial" w:cs="Arial" w:eastAsia="Arial" w:hAnsi="Arial"/>
@@ -7252,7 +7254,7 @@
               <w:spacing w:after="10" w:before="0"/>
               <w:ind w:left="120"/>
             </w:pPr>
-            <w:hyperlink w:history="1" r:id="rIdof8maxv9k1n20qkaxcopl">
+            <w:hyperlink w:history="1" r:id="rIdfb_uxhnip09slozblf-73">
               <w:r>
                 <w:rPr>
                   <w:rFonts w:ascii="Arial" w:cs="Arial" w:eastAsia="Arial" w:hAnsi="Arial"/>
@@ -7297,7 +7299,7 @@
             <w:pPr>
               <w:spacing w:after="20" w:before="0"/>
             </w:pPr>
-            <w:hyperlink w:history="1" r:id="rIdbghickliwljh8fyxz9vv1">
+            <w:hyperlink w:history="1" r:id="rId46jvdsm43cqzhkdwsh-kn">
               <w:r>
                 <w:rPr>
                   <w:rFonts w:ascii="Arial" w:cs="Arial" w:eastAsia="Arial" w:hAnsi="Arial"/>
@@ -7330,7 +7332,7 @@
               <w:spacing w:after="10" w:before="0"/>
               <w:ind w:left="120"/>
             </w:pPr>
-            <w:hyperlink w:history="1" r:id="rIdptggatrnhowjuwwojwask">
+            <w:hyperlink w:history="1" r:id="rIdpfcclgmzeiu2wrtmofrvg">
               <w:r>
                 <w:rPr>
                   <w:rFonts w:ascii="Arial" w:cs="Arial" w:eastAsia="Arial" w:hAnsi="Arial"/>
@@ -7346,7 +7348,7 @@
         </w:tc>
         <w:tc>
           <w:tcPr>
-            <w:tcW w:type="dxa" w:w="2556"/>
+            <w:tcW w:type="dxa" w:w="3324"/>
             <w:shd w:fill="FFFFFF" w:color="auto" w:val="clear"/>
             <w:tcMar>
               <w:top w:type="dxa" w:w="60"/>
@@ -7416,7 +7418,7 @@
         </w:tc>
         <w:tc>
           <w:tcPr>
-            <w:tcW w:type="dxa" w:w="2556"/>
+            <w:tcW w:type="dxa" w:w="2300"/>
             <w:shd w:fill="F2F2F2" w:color="auto" w:val="clear"/>
             <w:tcMar>
               <w:top w:type="dxa" w:w="60"/>
@@ -7467,7 +7469,7 @@
         </w:tc>
         <w:tc>
           <w:tcPr>
-            <w:tcW w:type="dxa" w:w="2556"/>
+            <w:tcW w:type="dxa" w:w="2300"/>
             <w:shd w:fill="FFFFFF" w:color="auto" w:val="clear"/>
             <w:tcMar>
               <w:top w:type="dxa" w:w="60"/>
@@ -7533,7 +7535,7 @@
         </w:tc>
         <w:tc>
           <w:tcPr>
-            <w:tcW w:type="dxa" w:w="2556"/>
+            <w:tcW w:type="dxa" w:w="2300"/>
             <w:shd w:fill="FFFFFF" w:color="auto" w:val="clear"/>
             <w:tcMar>
               <w:top w:type="dxa" w:w="60"/>
@@ -7614,7 +7616,7 @@
             <w:pPr>
               <w:spacing w:after="20" w:before="0"/>
             </w:pPr>
-            <w:hyperlink w:history="1" r:id="rId3iwyjrz_imtkrot8olpiu">
+            <w:hyperlink w:history="1" r:id="rIdnyyzzpvobsq-vfxaa2oca">
               <w:r>
                 <w:rPr>
                   <w:rFonts w:ascii="Arial" w:cs="Arial" w:eastAsia="Arial" w:hAnsi="Arial"/>
@@ -7647,7 +7649,7 @@
               <w:spacing w:after="10" w:before="0"/>
               <w:ind w:left="120"/>
             </w:pPr>
-            <w:hyperlink w:history="1" r:id="rIdu6i19lobbitk8ciw03mkc">
+            <w:hyperlink w:history="1" r:id="rIdfc33waw76ia0-b4qeitgf">
               <w:r>
                 <w:rPr>
                   <w:rFonts w:ascii="Arial" w:cs="Arial" w:eastAsia="Arial" w:hAnsi="Arial"/>
@@ -7692,7 +7694,7 @@
             <w:pPr>
               <w:spacing w:after="20" w:before="0"/>
             </w:pPr>
-            <w:hyperlink w:history="1" r:id="rId8hvzernrhdj_rptx2c-zy">
+            <w:hyperlink w:history="1" r:id="rIdc4arvupctmwwmapjqlqdk">
               <w:r>
                 <w:rPr>
                   <w:rFonts w:ascii="Arial" w:cs="Arial" w:eastAsia="Arial" w:hAnsi="Arial"/>
@@ -7725,7 +7727,7 @@
               <w:spacing w:after="10" w:before="0"/>
               <w:ind w:left="120"/>
             </w:pPr>
-            <w:hyperlink w:history="1" r:id="rId9okjzo-pfszb_kb9cl1zs">
+            <w:hyperlink w:history="1" r:id="rIdkaahwdjrvv_5nbb4vyuf7">
               <w:r>
                 <w:rPr>
                   <w:rFonts w:ascii="Arial" w:cs="Arial" w:eastAsia="Arial" w:hAnsi="Arial"/>
@@ -7741,7 +7743,7 @@
         </w:tc>
         <w:tc>
           <w:tcPr>
-            <w:tcW w:type="dxa" w:w="2556"/>
+            <w:tcW w:type="dxa" w:w="3324"/>
             <w:shd w:fill="FFFFFF" w:color="auto" w:val="clear"/>
             <w:tcMar>
               <w:top w:type="dxa" w:w="60"/>
@@ -7811,7 +7813,7 @@
         </w:tc>
         <w:tc>
           <w:tcPr>
-            <w:tcW w:type="dxa" w:w="2556"/>
+            <w:tcW w:type="dxa" w:w="2300"/>
             <w:shd w:fill="F2F2F2" w:color="auto" w:val="clear"/>
             <w:tcMar>
               <w:top w:type="dxa" w:w="60"/>
@@ -7881,7 +7883,7 @@
         </w:tc>
         <w:tc>
           <w:tcPr>
-            <w:tcW w:type="dxa" w:w="2556"/>
+            <w:tcW w:type="dxa" w:w="2300"/>
             <w:shd w:fill="FFFFFF" w:color="auto" w:val="clear"/>
             <w:tcMar>
               <w:top w:type="dxa" w:w="60"/>
@@ -7966,7 +7968,7 @@
         </w:tc>
         <w:tc>
           <w:tcPr>
-            <w:tcW w:type="dxa" w:w="2556"/>
+            <w:tcW w:type="dxa" w:w="2300"/>
             <w:shd w:fill="FFFFFF" w:color="auto" w:val="clear"/>
             <w:tcMar>
               <w:top w:type="dxa" w:w="60"/>
@@ -8028,7 +8030,7 @@
             <w:pPr>
               <w:spacing w:after="20" w:before="0"/>
             </w:pPr>
-            <w:hyperlink w:history="1" r:id="rIdgxsep6uj9qs65ndq9o02c">
+            <w:hyperlink w:history="1" r:id="rIdx_fdoewewyfou6dtbsjbq">
               <w:r>
                 <w:rPr>
                   <w:rFonts w:ascii="Arial" w:cs="Arial" w:eastAsia="Arial" w:hAnsi="Arial"/>
@@ -8061,7 +8063,7 @@
               <w:spacing w:after="10" w:before="0"/>
               <w:ind w:left="120"/>
             </w:pPr>
-            <w:hyperlink w:history="1" r:id="rIdcvk-xf95jhwlhtj5pt6pz">
+            <w:hyperlink w:history="1" r:id="rIdgjdprx_8mxp_pcuhiflro">
               <w:r>
                 <w:rPr>
                   <w:rFonts w:ascii="Arial" w:cs="Arial" w:eastAsia="Arial" w:hAnsi="Arial"/>
@@ -8106,7 +8108,7 @@
             <w:pPr>
               <w:spacing w:after="20" w:before="0"/>
             </w:pPr>
-            <w:hyperlink w:history="1" r:id="rId4lz77fg1t2nfwvhlrepef">
+            <w:hyperlink w:history="1" r:id="rId0_ce6wazfxy8-whcmgdc5">
               <w:r>
                 <w:rPr>
                   <w:rFonts w:ascii="Arial" w:cs="Arial" w:eastAsia="Arial" w:hAnsi="Arial"/>
@@ -8139,7 +8141,7 @@
               <w:spacing w:after="10" w:before="0"/>
               <w:ind w:left="120"/>
             </w:pPr>
-            <w:hyperlink w:history="1" r:id="rIdiewpbgh1w4fuvx4rwlyhd">
+            <w:hyperlink w:history="1" r:id="rIdor5esnlcvyxkytoo4glee">
               <w:r>
                 <w:rPr>
                   <w:rFonts w:ascii="Arial" w:cs="Arial" w:eastAsia="Arial" w:hAnsi="Arial"/>
@@ -8155,7 +8157,7 @@
         </w:tc>
         <w:tc>
           <w:tcPr>
-            <w:tcW w:type="dxa" w:w="2556"/>
+            <w:tcW w:type="dxa" w:w="3324"/>
             <w:shd w:fill="FFFFFF" w:color="auto" w:val="clear"/>
             <w:tcMar>
               <w:top w:type="dxa" w:w="60"/>
@@ -8225,7 +8227,7 @@
         </w:tc>
         <w:tc>
           <w:tcPr>
-            <w:tcW w:type="dxa" w:w="2556"/>
+            <w:tcW w:type="dxa" w:w="2300"/>
             <w:shd w:fill="F2F2F2" w:color="auto" w:val="clear"/>
             <w:tcMar>
               <w:top w:type="dxa" w:w="60"/>
@@ -8276,7 +8278,7 @@
         </w:tc>
         <w:tc>
           <w:tcPr>
-            <w:tcW w:type="dxa" w:w="2556"/>
+            <w:tcW w:type="dxa" w:w="2300"/>
             <w:shd w:fill="FFFFFF" w:color="auto" w:val="clear"/>
             <w:tcMar>
               <w:top w:type="dxa" w:w="60"/>
@@ -8380,7 +8382,7 @@
         </w:tc>
         <w:tc>
           <w:tcPr>
-            <w:tcW w:type="dxa" w:w="2556"/>
+            <w:tcW w:type="dxa" w:w="2300"/>
             <w:shd w:fill="FFFFFF" w:color="auto" w:val="clear"/>
             <w:tcMar>
               <w:top w:type="dxa" w:w="60"/>
@@ -8442,7 +8444,7 @@
             <w:pPr>
               <w:spacing w:after="20" w:before="0"/>
             </w:pPr>
-            <w:hyperlink w:history="1" r:id="rIdz1hb_sq1867dniib2ux2w">
+            <w:hyperlink w:history="1" r:id="rId7bhonoa_piifawnmpxm4m">
               <w:r>
                 <w:rPr>
                   <w:rFonts w:ascii="Arial" w:cs="Arial" w:eastAsia="Arial" w:hAnsi="Arial"/>
@@ -8475,7 +8477,7 @@
               <w:spacing w:after="10" w:before="0"/>
               <w:ind w:left="120"/>
             </w:pPr>
-            <w:hyperlink w:history="1" r:id="rIdiulndz2wgnietsm26nynv">
+            <w:hyperlink w:history="1" r:id="rIdijezb3xo-yzfvtomkohvh">
               <w:r>
                 <w:rPr>
                   <w:rFonts w:ascii="Arial" w:cs="Arial" w:eastAsia="Arial" w:hAnsi="Arial"/>
@@ -8520,7 +8522,7 @@
             <w:pPr>
               <w:spacing w:after="20" w:before="0"/>
             </w:pPr>
-            <w:hyperlink w:history="1" r:id="rIdcjqhp9z5wwvtvam9cpyck">
+            <w:hyperlink w:history="1" r:id="rId-bkshc-gi6zhjv4pbrdm-">
               <w:r>
                 <w:rPr>
                   <w:rFonts w:ascii="Arial" w:cs="Arial" w:eastAsia="Arial" w:hAnsi="Arial"/>
@@ -8553,7 +8555,7 @@
               <w:spacing w:after="10" w:before="0"/>
               <w:ind w:left="120"/>
             </w:pPr>
-            <w:hyperlink w:history="1" r:id="rIdhvgsjohxtaugmawbqoq3_">
+            <w:hyperlink w:history="1" r:id="rIdiwv9uliu38vke_c7tcwuc">
               <w:r>
                 <w:rPr>
                   <w:rFonts w:ascii="Arial" w:cs="Arial" w:eastAsia="Arial" w:hAnsi="Arial"/>
@@ -8569,7 +8571,7 @@
         </w:tc>
         <w:tc>
           <w:tcPr>
-            <w:tcW w:type="dxa" w:w="2556"/>
+            <w:tcW w:type="dxa" w:w="3324"/>
             <w:shd w:fill="FFFFFF" w:color="auto" w:val="clear"/>
             <w:tcMar>
               <w:top w:type="dxa" w:w="60"/>
@@ -8620,7 +8622,7 @@
         </w:tc>
         <w:tc>
           <w:tcPr>
-            <w:tcW w:type="dxa" w:w="2556"/>
+            <w:tcW w:type="dxa" w:w="2300"/>
             <w:shd w:fill="F2F2F2" w:color="auto" w:val="clear"/>
             <w:tcMar>
               <w:top w:type="dxa" w:w="60"/>
@@ -8652,7 +8654,7 @@
         </w:tc>
         <w:tc>
           <w:tcPr>
-            <w:tcW w:type="dxa" w:w="2556"/>
+            <w:tcW w:type="dxa" w:w="2300"/>
             <w:shd w:fill="FFFFFF" w:color="auto" w:val="clear"/>
             <w:tcMar>
               <w:top w:type="dxa" w:w="60"/>
@@ -8718,7 +8720,7 @@
         </w:tc>
         <w:tc>
           <w:tcPr>
-            <w:tcW w:type="dxa" w:w="2556"/>
+            <w:tcW w:type="dxa" w:w="2300"/>
             <w:shd w:fill="FFFFFF" w:color="auto" w:val="clear"/>
             <w:tcMar>
               <w:top w:type="dxa" w:w="60"/>
@@ -8780,7 +8782,7 @@
             <w:pPr>
               <w:spacing w:after="20" w:before="0"/>
             </w:pPr>
-            <w:hyperlink w:history="1" r:id="rIdcyneirhtgzgnvuuhk7dtc">
+            <w:hyperlink w:history="1" r:id="rIdw0owpwslc9l1hk_4bfwzk">
               <w:r>
                 <w:rPr>
                   <w:rFonts w:ascii="Arial" w:cs="Arial" w:eastAsia="Arial" w:hAnsi="Arial"/>
@@ -8813,7 +8815,7 @@
               <w:spacing w:after="10" w:before="0"/>
               <w:ind w:left="120"/>
             </w:pPr>
-            <w:hyperlink w:history="1" r:id="rIdcsg318ulr7ofp6_wxfccp">
+            <w:hyperlink w:history="1" r:id="rIdnirv5px9k3jiwiklkna8k">
               <w:r>
                 <w:rPr>
                   <w:rFonts w:ascii="Arial" w:cs="Arial" w:eastAsia="Arial" w:hAnsi="Arial"/>
@@ -8858,7 +8860,7 @@
             <w:pPr>
               <w:spacing w:after="20" w:before="0"/>
             </w:pPr>
-            <w:hyperlink w:history="1" r:id="rId8ctaxh6am4wtpbdzt8sgz">
+            <w:hyperlink w:history="1" r:id="rIdnh0fpcej0z8hyaywxxrnf">
               <w:r>
                 <w:rPr>
                   <w:rFonts w:ascii="Arial" w:cs="Arial" w:eastAsia="Arial" w:hAnsi="Arial"/>
@@ -8891,7 +8893,7 @@
               <w:spacing w:after="10" w:before="0"/>
               <w:ind w:left="120"/>
             </w:pPr>
-            <w:hyperlink w:history="1" r:id="rIdt974b3zkq6cbvcdx2luov">
+            <w:hyperlink w:history="1" r:id="rIds99rgzorxeyamvirmiroe">
               <w:r>
                 <w:rPr>
                   <w:rFonts w:ascii="Arial" w:cs="Arial" w:eastAsia="Arial" w:hAnsi="Arial"/>
@@ -8907,7 +8909,7 @@
         </w:tc>
         <w:tc>
           <w:tcPr>
-            <w:tcW w:type="dxa" w:w="2556"/>
+            <w:tcW w:type="dxa" w:w="3324"/>
             <w:shd w:fill="FFFFFF" w:color="auto" w:val="clear"/>
             <w:tcMar>
               <w:top w:type="dxa" w:w="60"/>
@@ -8977,7 +8979,7 @@
         </w:tc>
         <w:tc>
           <w:tcPr>
-            <w:tcW w:type="dxa" w:w="2556"/>
+            <w:tcW w:type="dxa" w:w="2300"/>
             <w:shd w:fill="F2F2F2" w:color="auto" w:val="clear"/>
             <w:tcMar>
               <w:top w:type="dxa" w:w="60"/>
@@ -9009,7 +9011,7 @@
         </w:tc>
         <w:tc>
           <w:tcPr>
-            <w:tcW w:type="dxa" w:w="2556"/>
+            <w:tcW w:type="dxa" w:w="2300"/>
             <w:shd w:fill="FFFFFF" w:color="auto" w:val="clear"/>
             <w:tcMar>
               <w:top w:type="dxa" w:w="60"/>
@@ -10569,11 +10571,11 @@
       </w:tblPr>
       <w:tblGrid>
         <w:gridCol w:w="900"/>
+        <w:gridCol w:w="2300"/>
         <w:gridCol w:w="2556"/>
-        <w:gridCol w:w="2556"/>
-        <w:gridCol w:w="2556"/>
-        <w:gridCol w:w="2556"/>
-        <w:gridCol w:w="2556"/>
+        <w:gridCol w:w="3324"/>
+        <w:gridCol w:w="2300"/>
+        <w:gridCol w:w="2300"/>
       </w:tblGrid>
       <w:tr>
         <w:tc>
@@ -10645,7 +10647,7 @@
         </w:tc>
         <w:tc>
           <w:tcPr>
-            <w:tcW w:type="dxa" w:w="2556"/>
+            <w:tcW w:type="dxa" w:w="2300"/>
             <w:shd w:fill="2E75B6" w:color="auto" w:val="clear"/>
             <w:tcMar>
               <w:top w:type="dxa" w:w="60"/>
@@ -10709,7 +10711,7 @@
         </w:tc>
         <w:tc>
           <w:tcPr>
-            <w:tcW w:type="dxa" w:w="2556"/>
+            <w:tcW w:type="dxa" w:w="3324"/>
             <w:shd w:fill="2E75B6" w:color="auto" w:val="clear"/>
             <w:tcMar>
               <w:top w:type="dxa" w:w="60"/>
@@ -10741,7 +10743,7 @@
         </w:tc>
         <w:tc>
           <w:tcPr>
-            <w:tcW w:type="dxa" w:w="2556"/>
+            <w:tcW w:type="dxa" w:w="2300"/>
             <w:shd w:fill="1F6B75" w:color="auto" w:val="clear"/>
             <w:tcMar>
               <w:top w:type="dxa" w:w="60"/>
@@ -10773,7 +10775,7 @@
         </w:tc>
         <w:tc>
           <w:tcPr>
-            <w:tcW w:type="dxa" w:w="2556"/>
+            <w:tcW w:type="dxa" w:w="2300"/>
             <w:shd w:fill="2E75B6" w:color="auto" w:val="clear"/>
             <w:tcMar>
               <w:top w:type="dxa" w:w="60"/>
@@ -10839,7 +10841,7 @@
         </w:tc>
         <w:tc>
           <w:tcPr>
-            <w:tcW w:type="dxa" w:w="2556"/>
+            <w:tcW w:type="dxa" w:w="2300"/>
             <w:shd w:fill="FFFFFF" w:color="auto" w:val="clear"/>
             <w:tcMar>
               <w:top w:type="dxa" w:w="60"/>
@@ -10901,7 +10903,7 @@
             <w:pPr>
               <w:spacing w:after="20" w:before="0"/>
             </w:pPr>
-            <w:hyperlink w:history="1" r:id="rId--kmvd8w8jcqmhgyotss_">
+            <w:hyperlink w:history="1" r:id="rIdkkjimxkssfkan80yd05fb">
               <w:r>
                 <w:rPr>
                   <w:rFonts w:ascii="Arial" w:cs="Arial" w:eastAsia="Arial" w:hAnsi="Arial"/>
@@ -10934,7 +10936,7 @@
               <w:spacing w:after="10" w:before="0"/>
               <w:ind w:left="120"/>
             </w:pPr>
-            <w:hyperlink w:history="1" r:id="rIdjqrun6x-rc-eg7aoggpkc">
+            <w:hyperlink w:history="1" r:id="rId_cfjw2d1wtbiwifh341ef">
               <w:r>
                 <w:rPr>
                   <w:rFonts w:ascii="Arial" w:cs="Arial" w:eastAsia="Arial" w:hAnsi="Arial"/>
@@ -10979,7 +10981,7 @@
             <w:pPr>
               <w:spacing w:after="20" w:before="0"/>
             </w:pPr>
-            <w:hyperlink w:history="1" r:id="rId6babs1z_xm_ll0gfzk1yz">
+            <w:hyperlink w:history="1" r:id="rId0v9dwonomdzjmjbrgz_oy">
               <w:r>
                 <w:rPr>
                   <w:rFonts w:ascii="Arial" w:cs="Arial" w:eastAsia="Arial" w:hAnsi="Arial"/>
@@ -11012,7 +11014,7 @@
               <w:spacing w:after="10" w:before="0"/>
               <w:ind w:left="120"/>
             </w:pPr>
-            <w:hyperlink w:history="1" r:id="rIdyvdnvr4ao4uozmhzq5ay6">
+            <w:hyperlink w:history="1" r:id="rId5vynvkgj4bzoyz3jg0tiu">
               <w:r>
                 <w:rPr>
                   <w:rFonts w:ascii="Arial" w:cs="Arial" w:eastAsia="Arial" w:hAnsi="Arial"/>
@@ -11028,7 +11030,7 @@
         </w:tc>
         <w:tc>
           <w:tcPr>
-            <w:tcW w:type="dxa" w:w="2556"/>
+            <w:tcW w:type="dxa" w:w="3324"/>
             <w:shd w:fill="FFFFFF" w:color="auto" w:val="clear"/>
             <w:tcMar>
               <w:top w:type="dxa" w:w="60"/>
@@ -11098,7 +11100,7 @@
         </w:tc>
         <w:tc>
           <w:tcPr>
-            <w:tcW w:type="dxa" w:w="2556"/>
+            <w:tcW w:type="dxa" w:w="2300"/>
             <w:shd w:fill="F2F2F2" w:color="auto" w:val="clear"/>
             <w:tcMar>
               <w:top w:type="dxa" w:w="60"/>
@@ -11149,7 +11151,7 @@
         </w:tc>
         <w:tc>
           <w:tcPr>
-            <w:tcW w:type="dxa" w:w="2556"/>
+            <w:tcW w:type="dxa" w:w="2300"/>
             <w:shd w:fill="FFFFFF" w:color="auto" w:val="clear"/>
             <w:tcMar>
               <w:top w:type="dxa" w:w="60"/>
@@ -11215,7 +11217,7 @@
         </w:tc>
         <w:tc>
           <w:tcPr>
-            <w:tcW w:type="dxa" w:w="2556"/>
+            <w:tcW w:type="dxa" w:w="2300"/>
             <w:shd w:fill="FFFFFF" w:color="auto" w:val="clear"/>
             <w:tcMar>
               <w:top w:type="dxa" w:w="60"/>
@@ -11353,7 +11355,7 @@
             <w:pPr>
               <w:spacing w:after="20" w:before="0"/>
             </w:pPr>
-            <w:hyperlink w:history="1" r:id="rIdperoulfyf0ilkrpqmbyfn">
+            <w:hyperlink w:history="1" r:id="rIdm-vardl_ppkrbmmdpjehf">
               <w:r>
                 <w:rPr>
                   <w:rFonts w:ascii="Arial" w:cs="Arial" w:eastAsia="Arial" w:hAnsi="Arial"/>
@@ -11386,7 +11388,7 @@
               <w:spacing w:after="10" w:before="0"/>
               <w:ind w:left="120"/>
             </w:pPr>
-            <w:hyperlink w:history="1" r:id="rIdmiqdfwttv8eymeg-vtwe4">
+            <w:hyperlink w:history="1" r:id="rId1ct9c5ftm6m4qmz8me-aj">
               <w:r>
                 <w:rPr>
                   <w:rFonts w:ascii="Arial" w:cs="Arial" w:eastAsia="Arial" w:hAnsi="Arial"/>
@@ -11431,7 +11433,7 @@
             <w:pPr>
               <w:spacing w:after="20" w:before="0"/>
             </w:pPr>
-            <w:hyperlink w:history="1" r:id="rIdhwicko3tzotw7-lotahyr">
+            <w:hyperlink w:history="1" r:id="rIdybmmqvbk9xog0f3ctap94">
               <w:r>
                 <w:rPr>
                   <w:rFonts w:ascii="Arial" w:cs="Arial" w:eastAsia="Arial" w:hAnsi="Arial"/>
@@ -11464,7 +11466,7 @@
               <w:spacing w:after="10" w:before="0"/>
               <w:ind w:left="120"/>
             </w:pPr>
-            <w:hyperlink w:history="1" r:id="rIds-1zcd-xl7mqgckv9n75q">
+            <w:hyperlink w:history="1" r:id="rIdx9m8pj8saicuwpcf-v-xs">
               <w:r>
                 <w:rPr>
                   <w:rFonts w:ascii="Arial" w:cs="Arial" w:eastAsia="Arial" w:hAnsi="Arial"/>
@@ -11480,7 +11482,7 @@
         </w:tc>
         <w:tc>
           <w:tcPr>
-            <w:tcW w:type="dxa" w:w="2556"/>
+            <w:tcW w:type="dxa" w:w="3324"/>
             <w:shd w:fill="FFFFFF" w:color="auto" w:val="clear"/>
             <w:tcMar>
               <w:top w:type="dxa" w:w="60"/>
@@ -11550,7 +11552,7 @@
         </w:tc>
         <w:tc>
           <w:tcPr>
-            <w:tcW w:type="dxa" w:w="2556"/>
+            <w:tcW w:type="dxa" w:w="2300"/>
             <w:shd w:fill="F2F2F2" w:color="auto" w:val="clear"/>
             <w:tcMar>
               <w:top w:type="dxa" w:w="60"/>
@@ -11601,7 +11603,7 @@
         </w:tc>
         <w:tc>
           <w:tcPr>
-            <w:tcW w:type="dxa" w:w="2556"/>
+            <w:tcW w:type="dxa" w:w="2300"/>
             <w:shd w:fill="FFFFFF" w:color="auto" w:val="clear"/>
             <w:tcMar>
               <w:top w:type="dxa" w:w="60"/>
@@ -11686,7 +11688,7 @@
         </w:tc>
         <w:tc>
           <w:tcPr>
-            <w:tcW w:type="dxa" w:w="2556"/>
+            <w:tcW w:type="dxa" w:w="2300"/>
             <w:shd w:fill="FFFFFF" w:color="auto" w:val="clear"/>
             <w:tcMar>
               <w:top w:type="dxa" w:w="60"/>
@@ -11748,7 +11750,7 @@
             <w:pPr>
               <w:spacing w:after="20" w:before="0"/>
             </w:pPr>
-            <w:hyperlink w:history="1" r:id="rIdag3mojodgmu-nyiad-obs">
+            <w:hyperlink w:history="1" r:id="rId0vhbwkxgzh3gfagcsc2sr">
               <w:r>
                 <w:rPr>
                   <w:rFonts w:ascii="Arial" w:cs="Arial" w:eastAsia="Arial" w:hAnsi="Arial"/>
@@ -11781,7 +11783,7 @@
               <w:spacing w:after="10" w:before="0"/>
               <w:ind w:left="120"/>
             </w:pPr>
-            <w:hyperlink w:history="1" r:id="rId0rkc0qyludtfdys5l95ma">
+            <w:hyperlink w:history="1" r:id="rIdajehck01kquhu4x5tifrv">
               <w:r>
                 <w:rPr>
                   <w:rFonts w:ascii="Arial" w:cs="Arial" w:eastAsia="Arial" w:hAnsi="Arial"/>
@@ -11826,7 +11828,7 @@
             <w:pPr>
               <w:spacing w:after="20" w:before="0"/>
             </w:pPr>
-            <w:hyperlink w:history="1" r:id="rId058l4svaeev8fk0qfmpxy">
+            <w:hyperlink w:history="1" r:id="rIdcw0zk9sxogi6vmz-rjxxx">
               <w:r>
                 <w:rPr>
                   <w:rFonts w:ascii="Arial" w:cs="Arial" w:eastAsia="Arial" w:hAnsi="Arial"/>
@@ -11859,7 +11861,7 @@
               <w:spacing w:after="10" w:before="0"/>
               <w:ind w:left="120"/>
             </w:pPr>
-            <w:hyperlink w:history="1" r:id="rIdehs_f_bm8kg1gwqiokaiy">
+            <w:hyperlink w:history="1" r:id="rIdpvbweitblc7i6opqn5upn">
               <w:r>
                 <w:rPr>
                   <w:rFonts w:ascii="Arial" w:cs="Arial" w:eastAsia="Arial" w:hAnsi="Arial"/>
@@ -11875,7 +11877,7 @@
         </w:tc>
         <w:tc>
           <w:tcPr>
-            <w:tcW w:type="dxa" w:w="2556"/>
+            <w:tcW w:type="dxa" w:w="3324"/>
             <w:shd w:fill="FFFFFF" w:color="auto" w:val="clear"/>
             <w:tcMar>
               <w:top w:type="dxa" w:w="60"/>
@@ -11945,7 +11947,7 @@
         </w:tc>
         <w:tc>
           <w:tcPr>
-            <w:tcW w:type="dxa" w:w="2556"/>
+            <w:tcW w:type="dxa" w:w="2300"/>
             <w:shd w:fill="F2F2F2" w:color="auto" w:val="clear"/>
             <w:tcMar>
               <w:top w:type="dxa" w:w="60"/>
@@ -11996,7 +11998,7 @@
         </w:tc>
         <w:tc>
           <w:tcPr>
-            <w:tcW w:type="dxa" w:w="2556"/>
+            <w:tcW w:type="dxa" w:w="2300"/>
             <w:shd w:fill="FFFFFF" w:color="auto" w:val="clear"/>
             <w:tcMar>
               <w:top w:type="dxa" w:w="60"/>
@@ -12081,7 +12083,7 @@
         </w:tc>
         <w:tc>
           <w:tcPr>
-            <w:tcW w:type="dxa" w:w="2556"/>
+            <w:tcW w:type="dxa" w:w="2300"/>
             <w:shd w:fill="FFFFFF" w:color="auto" w:val="clear"/>
             <w:tcMar>
               <w:top w:type="dxa" w:w="60"/>
@@ -12143,7 +12145,7 @@
             <w:pPr>
               <w:spacing w:after="20" w:before="0"/>
             </w:pPr>
-            <w:hyperlink w:history="1" r:id="rIdrvyjs5lhqlx2yptox-lvv">
+            <w:hyperlink w:history="1" r:id="rIdowsdmlxajpbdydyfyfv7p">
               <w:r>
                 <w:rPr>
                   <w:rFonts w:ascii="Arial" w:cs="Arial" w:eastAsia="Arial" w:hAnsi="Arial"/>
@@ -12176,7 +12178,7 @@
               <w:spacing w:after="10" w:before="0"/>
               <w:ind w:left="120"/>
             </w:pPr>
-            <w:hyperlink w:history="1" r:id="rIdhw5ca6gsvto_unbh1b2yp">
+            <w:hyperlink w:history="1" r:id="rIds7t6ghyj6bpl1dqjpd5d5">
               <w:r>
                 <w:rPr>
                   <w:rFonts w:ascii="Arial" w:cs="Arial" w:eastAsia="Arial" w:hAnsi="Arial"/>
@@ -12221,7 +12223,7 @@
             <w:pPr>
               <w:spacing w:after="20" w:before="0"/>
             </w:pPr>
-            <w:hyperlink w:history="1" r:id="rIdvrmyfgr0flvhggifyce2m">
+            <w:hyperlink w:history="1" r:id="rIdioeh2sc5k--vbd2d9qg_k">
               <w:r>
                 <w:rPr>
                   <w:rFonts w:ascii="Arial" w:cs="Arial" w:eastAsia="Arial" w:hAnsi="Arial"/>
@@ -12254,7 +12256,7 @@
               <w:spacing w:after="10" w:before="0"/>
               <w:ind w:left="120"/>
             </w:pPr>
-            <w:hyperlink w:history="1" r:id="rIdwqfu9_bbp3kr8mgbj_uyd">
+            <w:hyperlink w:history="1" r:id="rId9gkhnlbbx_s6lj-1pgvur">
               <w:r>
                 <w:rPr>
                   <w:rFonts w:ascii="Arial" w:cs="Arial" w:eastAsia="Arial" w:hAnsi="Arial"/>
@@ -12270,7 +12272,7 @@
         </w:tc>
         <w:tc>
           <w:tcPr>
-            <w:tcW w:type="dxa" w:w="2556"/>
+            <w:tcW w:type="dxa" w:w="3324"/>
             <w:shd w:fill="FFFFFF" w:color="auto" w:val="clear"/>
             <w:tcMar>
               <w:top w:type="dxa" w:w="60"/>
@@ -12321,7 +12323,7 @@
         </w:tc>
         <w:tc>
           <w:tcPr>
-            <w:tcW w:type="dxa" w:w="2556"/>
+            <w:tcW w:type="dxa" w:w="2300"/>
             <w:shd w:fill="F2F2F2" w:color="auto" w:val="clear"/>
             <w:tcMar>
               <w:top w:type="dxa" w:w="60"/>
@@ -12353,7 +12355,7 @@
         </w:tc>
         <w:tc>
           <w:tcPr>
-            <w:tcW w:type="dxa" w:w="2556"/>
+            <w:tcW w:type="dxa" w:w="2300"/>
             <w:shd w:fill="FFFFFF" w:color="auto" w:val="clear"/>
             <w:tcMar>
               <w:top w:type="dxa" w:w="60"/>
@@ -12419,7 +12421,7 @@
         </w:tc>
         <w:tc>
           <w:tcPr>
-            <w:tcW w:type="dxa" w:w="2556"/>
+            <w:tcW w:type="dxa" w:w="2300"/>
             <w:shd w:fill="FFFFFF" w:color="auto" w:val="clear"/>
             <w:tcMar>
               <w:top w:type="dxa" w:w="60"/>
@@ -12481,7 +12483,7 @@
             <w:pPr>
               <w:spacing w:after="20" w:before="0"/>
             </w:pPr>
-            <w:hyperlink w:history="1" r:id="rIdsx-oquqcbs9sgllkr4qul">
+            <w:hyperlink w:history="1" r:id="rIduq7y-_hlohoj4w6xaxnrn">
               <w:r>
                 <w:rPr>
                   <w:rFonts w:ascii="Arial" w:cs="Arial" w:eastAsia="Arial" w:hAnsi="Arial"/>
@@ -12514,7 +12516,7 @@
               <w:spacing w:after="10" w:before="0"/>
               <w:ind w:left="120"/>
             </w:pPr>
-            <w:hyperlink w:history="1" r:id="rId3r6iwdqlmish0rv-7qedr">
+            <w:hyperlink w:history="1" r:id="rIdccob1-iw5-sunezuofgxw">
               <w:r>
                 <w:rPr>
                   <w:rFonts w:ascii="Arial" w:cs="Arial" w:eastAsia="Arial" w:hAnsi="Arial"/>
@@ -12559,7 +12561,7 @@
             <w:pPr>
               <w:spacing w:after="20" w:before="0"/>
             </w:pPr>
-            <w:hyperlink w:history="1" r:id="rIdmgtcb9hdwgpu8swodhhc1">
+            <w:hyperlink w:history="1" r:id="rIdwqnb15ilxel7y3doizvba">
               <w:r>
                 <w:rPr>
                   <w:rFonts w:ascii="Arial" w:cs="Arial" w:eastAsia="Arial" w:hAnsi="Arial"/>
@@ -12592,7 +12594,7 @@
               <w:spacing w:after="10" w:before="0"/>
               <w:ind w:left="120"/>
             </w:pPr>
-            <w:hyperlink w:history="1" r:id="rIdzfd2z1wbtlwdjjwabocab">
+            <w:hyperlink w:history="1" r:id="rIdjxzgerqpcmdxeucb3jdua">
               <w:r>
                 <w:rPr>
                   <w:rFonts w:ascii="Arial" w:cs="Arial" w:eastAsia="Arial" w:hAnsi="Arial"/>
@@ -12608,7 +12610,7 @@
         </w:tc>
         <w:tc>
           <w:tcPr>
-            <w:tcW w:type="dxa" w:w="2556"/>
+            <w:tcW w:type="dxa" w:w="3324"/>
             <w:shd w:fill="FFFFFF" w:color="auto" w:val="clear"/>
             <w:tcMar>
               <w:top w:type="dxa" w:w="60"/>
@@ -12659,7 +12661,7 @@
         </w:tc>
         <w:tc>
           <w:tcPr>
-            <w:tcW w:type="dxa" w:w="2556"/>
+            <w:tcW w:type="dxa" w:w="2300"/>
             <w:shd w:fill="F2F2F2" w:color="auto" w:val="clear"/>
             <w:tcMar>
               <w:top w:type="dxa" w:w="60"/>
@@ -12691,7 +12693,7 @@
         </w:tc>
         <w:tc>
           <w:tcPr>
-            <w:tcW w:type="dxa" w:w="2556"/>
+            <w:tcW w:type="dxa" w:w="2300"/>
             <w:shd w:fill="FFFFFF" w:color="auto" w:val="clear"/>
             <w:tcMar>
               <w:top w:type="dxa" w:w="60"/>
@@ -14212,11 +14214,11 @@
       </w:tblPr>
       <w:tblGrid>
         <w:gridCol w:w="900"/>
+        <w:gridCol w:w="2300"/>
         <w:gridCol w:w="2556"/>
-        <w:gridCol w:w="2556"/>
-        <w:gridCol w:w="2556"/>
-        <w:gridCol w:w="2556"/>
-        <w:gridCol w:w="2556"/>
+        <w:gridCol w:w="3324"/>
+        <w:gridCol w:w="2300"/>
+        <w:gridCol w:w="2300"/>
       </w:tblGrid>
       <w:tr>
         <w:tc>
@@ -14288,7 +14290,7 @@
         </w:tc>
         <w:tc>
           <w:tcPr>
-            <w:tcW w:type="dxa" w:w="2556"/>
+            <w:tcW w:type="dxa" w:w="2300"/>
             <w:shd w:fill="2E75B6" w:color="auto" w:val="clear"/>
             <w:tcMar>
               <w:top w:type="dxa" w:w="60"/>
@@ -14352,7 +14354,7 @@
         </w:tc>
         <w:tc>
           <w:tcPr>
-            <w:tcW w:type="dxa" w:w="2556"/>
+            <w:tcW w:type="dxa" w:w="3324"/>
             <w:shd w:fill="2E75B6" w:color="auto" w:val="clear"/>
             <w:tcMar>
               <w:top w:type="dxa" w:w="60"/>
@@ -14384,7 +14386,7 @@
         </w:tc>
         <w:tc>
           <w:tcPr>
-            <w:tcW w:type="dxa" w:w="2556"/>
+            <w:tcW w:type="dxa" w:w="2300"/>
             <w:shd w:fill="1F6B75" w:color="auto" w:val="clear"/>
             <w:tcMar>
               <w:top w:type="dxa" w:w="60"/>
@@ -14416,7 +14418,7 @@
         </w:tc>
         <w:tc>
           <w:tcPr>
-            <w:tcW w:type="dxa" w:w="2556"/>
+            <w:tcW w:type="dxa" w:w="2300"/>
             <w:shd w:fill="2E75B6" w:color="auto" w:val="clear"/>
             <w:tcMar>
               <w:top w:type="dxa" w:w="60"/>
@@ -14482,7 +14484,7 @@
         </w:tc>
         <w:tc>
           <w:tcPr>
-            <w:tcW w:type="dxa" w:w="2556"/>
+            <w:tcW w:type="dxa" w:w="2300"/>
             <w:shd w:fill="FFFFFF" w:color="auto" w:val="clear"/>
             <w:tcMar>
               <w:top w:type="dxa" w:w="60"/>
@@ -14582,7 +14584,7 @@
             <w:pPr>
               <w:spacing w:after="20" w:before="0"/>
             </w:pPr>
-            <w:hyperlink w:history="1" r:id="rId4g7jrtpfp32xncu-e4nr3">
+            <w:hyperlink w:history="1" r:id="rIdny_ihxnw2osqer0kx4v0m">
               <w:r>
                 <w:rPr>
                   <w:rFonts w:ascii="Arial" w:cs="Arial" w:eastAsia="Arial" w:hAnsi="Arial"/>
@@ -14615,7 +14617,7 @@
               <w:spacing w:after="10" w:before="0"/>
               <w:ind w:left="120"/>
             </w:pPr>
-            <w:hyperlink w:history="1" r:id="rIdier7m5zusuuzicwunas6g">
+            <w:hyperlink w:history="1" r:id="rId1vtqsqybjuca6h2saorht">
               <w:r>
                 <w:rPr>
                   <w:rFonts w:ascii="Arial" w:cs="Arial" w:eastAsia="Arial" w:hAnsi="Arial"/>
@@ -14660,7 +14662,7 @@
             <w:pPr>
               <w:spacing w:after="20" w:before="0"/>
             </w:pPr>
-            <w:hyperlink w:history="1" r:id="rIdj3h2bffhr_ubcko3dzts9">
+            <w:hyperlink w:history="1" r:id="rId0rhfwwq5nssm9eoxzbkrp">
               <w:r>
                 <w:rPr>
                   <w:rFonts w:ascii="Arial" w:cs="Arial" w:eastAsia="Arial" w:hAnsi="Arial"/>
@@ -14693,7 +14695,7 @@
               <w:spacing w:after="10" w:before="0"/>
               <w:ind w:left="120"/>
             </w:pPr>
-            <w:hyperlink w:history="1" r:id="rIdzmvyr8vmjobrb_6l1n92o">
+            <w:hyperlink w:history="1" r:id="rIdoubufjwvwsz3djd3p0r-f">
               <w:r>
                 <w:rPr>
                   <w:rFonts w:ascii="Arial" w:cs="Arial" w:eastAsia="Arial" w:hAnsi="Arial"/>
@@ -14709,7 +14711,7 @@
         </w:tc>
         <w:tc>
           <w:tcPr>
-            <w:tcW w:type="dxa" w:w="2556"/>
+            <w:tcW w:type="dxa" w:w="3324"/>
             <w:shd w:fill="FFFFFF" w:color="auto" w:val="clear"/>
             <w:tcMar>
               <w:top w:type="dxa" w:w="60"/>
@@ -14779,7 +14781,7 @@
         </w:tc>
         <w:tc>
           <w:tcPr>
-            <w:tcW w:type="dxa" w:w="2556"/>
+            <w:tcW w:type="dxa" w:w="2300"/>
             <w:shd w:fill="F2F2F2" w:color="auto" w:val="clear"/>
             <w:tcMar>
               <w:top w:type="dxa" w:w="60"/>
@@ -14830,7 +14832,7 @@
         </w:tc>
         <w:tc>
           <w:tcPr>
-            <w:tcW w:type="dxa" w:w="2556"/>
+            <w:tcW w:type="dxa" w:w="2300"/>
             <w:shd w:fill="FFFFFF" w:color="auto" w:val="clear"/>
             <w:tcMar>
               <w:top w:type="dxa" w:w="60"/>
@@ -14915,7 +14917,7 @@
         </w:tc>
         <w:tc>
           <w:tcPr>
-            <w:tcW w:type="dxa" w:w="2556"/>
+            <w:tcW w:type="dxa" w:w="2300"/>
             <w:shd w:fill="FFFFFF" w:color="auto" w:val="clear"/>
             <w:tcMar>
               <w:top w:type="dxa" w:w="60"/>
@@ -15072,7 +15074,7 @@
             <w:pPr>
               <w:spacing w:after="20" w:before="0"/>
             </w:pPr>
-            <w:hyperlink w:history="1" r:id="rIdzw4mt7v11o2o8_b55x9sd">
+            <w:hyperlink w:history="1" r:id="rId5_0jnf_qlgk-ucvuhkrjx">
               <w:r>
                 <w:rPr>
                   <w:rFonts w:ascii="Arial" w:cs="Arial" w:eastAsia="Arial" w:hAnsi="Arial"/>
@@ -15105,7 +15107,7 @@
               <w:spacing w:after="10" w:before="0"/>
               <w:ind w:left="120"/>
             </w:pPr>
-            <w:hyperlink w:history="1" r:id="rIdikdcigg4_hni3jdk5vpnp">
+            <w:hyperlink w:history="1" r:id="rIdwwfkauiqaiyicd_id540y">
               <w:r>
                 <w:rPr>
                   <w:rFonts w:ascii="Arial" w:cs="Arial" w:eastAsia="Arial" w:hAnsi="Arial"/>
@@ -15150,7 +15152,7 @@
             <w:pPr>
               <w:spacing w:after="20" w:before="0"/>
             </w:pPr>
-            <w:hyperlink w:history="1" r:id="rIdzctg6g0z4znptmlatx3uo">
+            <w:hyperlink w:history="1" r:id="rId0bvmeio8xijcsou5f5jwp">
               <w:r>
                 <w:rPr>
                   <w:rFonts w:ascii="Arial" w:cs="Arial" w:eastAsia="Arial" w:hAnsi="Arial"/>
@@ -15183,7 +15185,7 @@
               <w:spacing w:after="10" w:before="0"/>
               <w:ind w:left="120"/>
             </w:pPr>
-            <w:hyperlink w:history="1" r:id="rIdxggk3vhij56wp4xk5ystw">
+            <w:hyperlink w:history="1" r:id="rIdf6eha6qo3km0l1q1a2vk_">
               <w:r>
                 <w:rPr>
                   <w:rFonts w:ascii="Arial" w:cs="Arial" w:eastAsia="Arial" w:hAnsi="Arial"/>
@@ -15199,7 +15201,7 @@
         </w:tc>
         <w:tc>
           <w:tcPr>
-            <w:tcW w:type="dxa" w:w="2556"/>
+            <w:tcW w:type="dxa" w:w="3324"/>
             <w:shd w:fill="FFFFFF" w:color="auto" w:val="clear"/>
             <w:tcMar>
               <w:top w:type="dxa" w:w="60"/>
@@ -15269,7 +15271,7 @@
         </w:tc>
         <w:tc>
           <w:tcPr>
-            <w:tcW w:type="dxa" w:w="2556"/>
+            <w:tcW w:type="dxa" w:w="2300"/>
             <w:shd w:fill="F2F2F2" w:color="auto" w:val="clear"/>
             <w:tcMar>
               <w:top w:type="dxa" w:w="60"/>
@@ -15320,7 +15322,7 @@
         </w:tc>
         <w:tc>
           <w:tcPr>
-            <w:tcW w:type="dxa" w:w="2556"/>
+            <w:tcW w:type="dxa" w:w="2300"/>
             <w:shd w:fill="FFFFFF" w:color="auto" w:val="clear"/>
             <w:tcMar>
               <w:top w:type="dxa" w:w="60"/>
@@ -15405,7 +15407,7 @@
         </w:tc>
         <w:tc>
           <w:tcPr>
-            <w:tcW w:type="dxa" w:w="2556"/>
+            <w:tcW w:type="dxa" w:w="2300"/>
             <w:shd w:fill="FFFFFF" w:color="auto" w:val="clear"/>
             <w:tcMar>
               <w:top w:type="dxa" w:w="60"/>
@@ -15543,7 +15545,7 @@
             <w:pPr>
               <w:spacing w:after="20" w:before="0"/>
             </w:pPr>
-            <w:hyperlink w:history="1" r:id="rIdxboogq1gzimvlakqadsqb">
+            <w:hyperlink w:history="1" r:id="rId1trhep6cwrs7jlieljk6l">
               <w:r>
                 <w:rPr>
                   <w:rFonts w:ascii="Arial" w:cs="Arial" w:eastAsia="Arial" w:hAnsi="Arial"/>
@@ -15576,7 +15578,7 @@
               <w:spacing w:after="10" w:before="0"/>
               <w:ind w:left="120"/>
             </w:pPr>
-            <w:hyperlink w:history="1" r:id="rIdxn7lws0anwrqrqkpwx0w_">
+            <w:hyperlink w:history="1" r:id="rIdlh_oiqhe2v2iz_dm4pcbn">
               <w:r>
                 <w:rPr>
                   <w:rFonts w:ascii="Arial" w:cs="Arial" w:eastAsia="Arial" w:hAnsi="Arial"/>
@@ -15621,7 +15623,7 @@
             <w:pPr>
               <w:spacing w:after="20" w:before="0"/>
             </w:pPr>
-            <w:hyperlink w:history="1" r:id="rIdxicrxljvu4kaj_ysy3a7c">
+            <w:hyperlink w:history="1" r:id="rIdzghzb-voe_geb5ei_cegn">
               <w:r>
                 <w:rPr>
                   <w:rFonts w:ascii="Arial" w:cs="Arial" w:eastAsia="Arial" w:hAnsi="Arial"/>
@@ -15654,7 +15656,7 @@
               <w:spacing w:after="10" w:before="0"/>
               <w:ind w:left="120"/>
             </w:pPr>
-            <w:hyperlink w:history="1" r:id="rIdt3zdy5yw60ep173prfbbn">
+            <w:hyperlink w:history="1" r:id="rIdevegluuyaww7w9l_u1r_l">
               <w:r>
                 <w:rPr>
                   <w:rFonts w:ascii="Arial" w:cs="Arial" w:eastAsia="Arial" w:hAnsi="Arial"/>
@@ -15670,7 +15672,7 @@
         </w:tc>
         <w:tc>
           <w:tcPr>
-            <w:tcW w:type="dxa" w:w="2556"/>
+            <w:tcW w:type="dxa" w:w="3324"/>
             <w:shd w:fill="FFFFFF" w:color="auto" w:val="clear"/>
             <w:tcMar>
               <w:top w:type="dxa" w:w="60"/>
@@ -15778,7 +15780,7 @@
         </w:tc>
         <w:tc>
           <w:tcPr>
-            <w:tcW w:type="dxa" w:w="2556"/>
+            <w:tcW w:type="dxa" w:w="2300"/>
             <w:shd w:fill="F2F2F2" w:color="auto" w:val="clear"/>
             <w:tcMar>
               <w:top w:type="dxa" w:w="60"/>
@@ -15829,7 +15831,7 @@
         </w:tc>
         <w:tc>
           <w:tcPr>
-            <w:tcW w:type="dxa" w:w="2556"/>
+            <w:tcW w:type="dxa" w:w="2300"/>
             <w:shd w:fill="FFFFFF" w:color="auto" w:val="clear"/>
             <w:tcMar>
               <w:top w:type="dxa" w:w="60"/>
@@ -15914,7 +15916,7 @@
         </w:tc>
         <w:tc>
           <w:tcPr>
-            <w:tcW w:type="dxa" w:w="2556"/>
+            <w:tcW w:type="dxa" w:w="2300"/>
             <w:shd w:fill="FFFFFF" w:color="auto" w:val="clear"/>
             <w:tcMar>
               <w:top w:type="dxa" w:w="60"/>
@@ -15976,7 +15978,7 @@
             <w:pPr>
               <w:spacing w:after="20" w:before="0"/>
             </w:pPr>
-            <w:hyperlink w:history="1" r:id="rIdwdrreoufvn5x4b67j8ixi">
+            <w:hyperlink w:history="1" r:id="rId_ng7qxnbb3le-ttqyasv3">
               <w:r>
                 <w:rPr>
                   <w:rFonts w:ascii="Arial" w:cs="Arial" w:eastAsia="Arial" w:hAnsi="Arial"/>
@@ -16009,7 +16011,7 @@
               <w:spacing w:after="10" w:before="0"/>
               <w:ind w:left="120"/>
             </w:pPr>
-            <w:hyperlink w:history="1" r:id="rIdyxg76d9hjs0uplls6s16_">
+            <w:hyperlink w:history="1" r:id="rIdxdggotq9yhscinmxwxrv6">
               <w:r>
                 <w:rPr>
                   <w:rFonts w:ascii="Arial" w:cs="Arial" w:eastAsia="Arial" w:hAnsi="Arial"/>
@@ -16054,7 +16056,7 @@
             <w:pPr>
               <w:spacing w:after="20" w:before="0"/>
             </w:pPr>
-            <w:hyperlink w:history="1" r:id="rIdbqshdlrarxvtut-an4r3j">
+            <w:hyperlink w:history="1" r:id="rId7o3baapn0i0amttq1z8ov">
               <w:r>
                 <w:rPr>
                   <w:rFonts w:ascii="Arial" w:cs="Arial" w:eastAsia="Arial" w:hAnsi="Arial"/>
@@ -16087,7 +16089,7 @@
               <w:spacing w:after="10" w:before="0"/>
               <w:ind w:left="120"/>
             </w:pPr>
-            <w:hyperlink w:history="1" r:id="rIdrlypyisxe53fcwjzgudwi">
+            <w:hyperlink w:history="1" r:id="rIdxzq4in-oxdhhnlt-cv60x">
               <w:r>
                 <w:rPr>
                   <w:rFonts w:ascii="Arial" w:cs="Arial" w:eastAsia="Arial" w:hAnsi="Arial"/>
@@ -16103,7 +16105,7 @@
         </w:tc>
         <w:tc>
           <w:tcPr>
-            <w:tcW w:type="dxa" w:w="2556"/>
+            <w:tcW w:type="dxa" w:w="3324"/>
             <w:shd w:fill="FFFFFF" w:color="auto" w:val="clear"/>
             <w:tcMar>
               <w:top w:type="dxa" w:w="60"/>
@@ -16154,7 +16156,7 @@
         </w:tc>
         <w:tc>
           <w:tcPr>
-            <w:tcW w:type="dxa" w:w="2556"/>
+            <w:tcW w:type="dxa" w:w="2300"/>
             <w:shd w:fill="F2F2F2" w:color="auto" w:val="clear"/>
             <w:tcMar>
               <w:top w:type="dxa" w:w="60"/>
@@ -16186,7 +16188,7 @@
         </w:tc>
         <w:tc>
           <w:tcPr>
-            <w:tcW w:type="dxa" w:w="2556"/>
+            <w:tcW w:type="dxa" w:w="2300"/>
             <w:shd w:fill="FFFFFF" w:color="auto" w:val="clear"/>
             <w:tcMar>
               <w:top w:type="dxa" w:w="60"/>
@@ -16252,7 +16254,7 @@
         </w:tc>
         <w:tc>
           <w:tcPr>
-            <w:tcW w:type="dxa" w:w="2556"/>
+            <w:tcW w:type="dxa" w:w="2300"/>
             <w:shd w:fill="FFFFFF" w:color="auto" w:val="clear"/>
             <w:tcMar>
               <w:top w:type="dxa" w:w="60"/>
@@ -16314,7 +16316,7 @@
             <w:pPr>
               <w:spacing w:after="20" w:before="0"/>
             </w:pPr>
-            <w:hyperlink w:history="1" r:id="rIdikm820xdvzwo9ol26sjgs">
+            <w:hyperlink w:history="1" r:id="rIdmkbkwqhhghlwh9yzcwcvf">
               <w:r>
                 <w:rPr>
                   <w:rFonts w:ascii="Arial" w:cs="Arial" w:eastAsia="Arial" w:hAnsi="Arial"/>
@@ -16347,7 +16349,7 @@
               <w:spacing w:after="10" w:before="0"/>
               <w:ind w:left="120"/>
             </w:pPr>
-            <w:hyperlink w:history="1" r:id="rId05wcniolwdz17-mtinja8">
+            <w:hyperlink w:history="1" r:id="rIdy2rm9xrhvdgxrrxxqgimw">
               <w:r>
                 <w:rPr>
                   <w:rFonts w:ascii="Arial" w:cs="Arial" w:eastAsia="Arial" w:hAnsi="Arial"/>
@@ -16392,7 +16394,7 @@
             <w:pPr>
               <w:spacing w:after="20" w:before="0"/>
             </w:pPr>
-            <w:hyperlink w:history="1" r:id="rIdflrogzznj7rdcsq0uovpx">
+            <w:hyperlink w:history="1" r:id="rId12ug9zajlkztpd9ttws45">
               <w:r>
                 <w:rPr>
                   <w:rFonts w:ascii="Arial" w:cs="Arial" w:eastAsia="Arial" w:hAnsi="Arial"/>
@@ -16425,7 +16427,7 @@
               <w:spacing w:after="10" w:before="0"/>
               <w:ind w:left="120"/>
             </w:pPr>
-            <w:hyperlink w:history="1" r:id="rIdwavgq41dirqxgpi9zqrc_">
+            <w:hyperlink w:history="1" r:id="rIdcpycvqyvgdagx2s2oqwjs">
               <w:r>
                 <w:rPr>
                   <w:rFonts w:ascii="Arial" w:cs="Arial" w:eastAsia="Arial" w:hAnsi="Arial"/>
@@ -16441,7 +16443,7 @@
         </w:tc>
         <w:tc>
           <w:tcPr>
-            <w:tcW w:type="dxa" w:w="2556"/>
+            <w:tcW w:type="dxa" w:w="3324"/>
             <w:shd w:fill="FFFFFF" w:color="auto" w:val="clear"/>
             <w:tcMar>
               <w:top w:type="dxa" w:w="60"/>
@@ -16492,7 +16494,7 @@
         </w:tc>
         <w:tc>
           <w:tcPr>
-            <w:tcW w:type="dxa" w:w="2556"/>
+            <w:tcW w:type="dxa" w:w="2300"/>
             <w:shd w:fill="F2F2F2" w:color="auto" w:val="clear"/>
             <w:tcMar>
               <w:top w:type="dxa" w:w="60"/>
@@ -16524,7 +16526,7 @@
         </w:tc>
         <w:tc>
           <w:tcPr>
-            <w:tcW w:type="dxa" w:w="2556"/>
+            <w:tcW w:type="dxa" w:w="2300"/>
             <w:shd w:fill="FFFFFF" w:color="auto" w:val="clear"/>
             <w:tcMar>
               <w:top w:type="dxa" w:w="60"/>
@@ -18084,11 +18086,11 @@
       </w:tblPr>
       <w:tblGrid>
         <w:gridCol w:w="900"/>
+        <w:gridCol w:w="2300"/>
         <w:gridCol w:w="2556"/>
-        <w:gridCol w:w="2556"/>
-        <w:gridCol w:w="2556"/>
-        <w:gridCol w:w="2556"/>
-        <w:gridCol w:w="2556"/>
+        <w:gridCol w:w="3324"/>
+        <w:gridCol w:w="2300"/>
+        <w:gridCol w:w="2300"/>
       </w:tblGrid>
       <w:tr>
         <w:tc>
@@ -18160,7 +18162,7 @@
         </w:tc>
         <w:tc>
           <w:tcPr>
-            <w:tcW w:type="dxa" w:w="2556"/>
+            <w:tcW w:type="dxa" w:w="2300"/>
             <w:shd w:fill="2E75B6" w:color="auto" w:val="clear"/>
             <w:tcMar>
               <w:top w:type="dxa" w:w="60"/>
@@ -18224,7 +18226,7 @@
         </w:tc>
         <w:tc>
           <w:tcPr>
-            <w:tcW w:type="dxa" w:w="2556"/>
+            <w:tcW w:type="dxa" w:w="3324"/>
             <w:shd w:fill="2E75B6" w:color="auto" w:val="clear"/>
             <w:tcMar>
               <w:top w:type="dxa" w:w="60"/>
@@ -18256,7 +18258,7 @@
         </w:tc>
         <w:tc>
           <w:tcPr>
-            <w:tcW w:type="dxa" w:w="2556"/>
+            <w:tcW w:type="dxa" w:w="2300"/>
             <w:shd w:fill="1F6B75" w:color="auto" w:val="clear"/>
             <w:tcMar>
               <w:top w:type="dxa" w:w="60"/>
@@ -18288,7 +18290,7 @@
         </w:tc>
         <w:tc>
           <w:tcPr>
-            <w:tcW w:type="dxa" w:w="2556"/>
+            <w:tcW w:type="dxa" w:w="2300"/>
             <w:shd w:fill="2E75B6" w:color="auto" w:val="clear"/>
             <w:tcMar>
               <w:top w:type="dxa" w:w="60"/>
@@ -18354,7 +18356,7 @@
         </w:tc>
         <w:tc>
           <w:tcPr>
-            <w:tcW w:type="dxa" w:w="2556"/>
+            <w:tcW w:type="dxa" w:w="2300"/>
             <w:shd w:fill="FFFFFF" w:color="auto" w:val="clear"/>
             <w:tcMar>
               <w:top w:type="dxa" w:w="60"/>
@@ -18416,7 +18418,7 @@
             <w:pPr>
               <w:spacing w:after="20" w:before="0"/>
             </w:pPr>
-            <w:hyperlink w:history="1" r:id="rIdnx-bo33pkyeyvpdma3z7s">
+            <w:hyperlink w:history="1" r:id="rIdwdznop95cgggb8uuluc6f">
               <w:r>
                 <w:rPr>
                   <w:rFonts w:ascii="Arial" w:cs="Arial" w:eastAsia="Arial" w:hAnsi="Arial"/>
@@ -18449,7 +18451,7 @@
               <w:spacing w:after="10" w:before="0"/>
               <w:ind w:left="120"/>
             </w:pPr>
-            <w:hyperlink w:history="1" r:id="rIdwhl26etzkngjgqvwex8ku">
+            <w:hyperlink w:history="1" r:id="rIdj80psqnxdritkpn5esx4l">
               <w:r>
                 <w:rPr>
                   <w:rFonts w:ascii="Arial" w:cs="Arial" w:eastAsia="Arial" w:hAnsi="Arial"/>
@@ -18494,7 +18496,7 @@
             <w:pPr>
               <w:spacing w:after="20" w:before="0"/>
             </w:pPr>
-            <w:hyperlink w:history="1" r:id="rIdnrnkcm1lhfsxnxyojkxui">
+            <w:hyperlink w:history="1" r:id="rIdziar-zk7ocz1b-pikmkik">
               <w:r>
                 <w:rPr>
                   <w:rFonts w:ascii="Arial" w:cs="Arial" w:eastAsia="Arial" w:hAnsi="Arial"/>
@@ -18527,7 +18529,7 @@
               <w:spacing w:after="10" w:before="0"/>
               <w:ind w:left="120"/>
             </w:pPr>
-            <w:hyperlink w:history="1" r:id="rIdahgfk2trcbb0qobj_n2sc">
+            <w:hyperlink w:history="1" r:id="rId_sks82gp3hvy-xfmzqpdh">
               <w:r>
                 <w:rPr>
                   <w:rFonts w:ascii="Arial" w:cs="Arial" w:eastAsia="Arial" w:hAnsi="Arial"/>
@@ -18543,7 +18545,7 @@
         </w:tc>
         <w:tc>
           <w:tcPr>
-            <w:tcW w:type="dxa" w:w="2556"/>
+            <w:tcW w:type="dxa" w:w="3324"/>
             <w:shd w:fill="FFFFFF" w:color="auto" w:val="clear"/>
             <w:tcMar>
               <w:top w:type="dxa" w:w="60"/>
@@ -18613,7 +18615,7 @@
         </w:tc>
         <w:tc>
           <w:tcPr>
-            <w:tcW w:type="dxa" w:w="2556"/>
+            <w:tcW w:type="dxa" w:w="2300"/>
             <w:shd w:fill="F2F2F2" w:color="auto" w:val="clear"/>
             <w:tcMar>
               <w:top w:type="dxa" w:w="60"/>
@@ -18664,7 +18666,7 @@
         </w:tc>
         <w:tc>
           <w:tcPr>
-            <w:tcW w:type="dxa" w:w="2556"/>
+            <w:tcW w:type="dxa" w:w="2300"/>
             <w:shd w:fill="FFFFFF" w:color="auto" w:val="clear"/>
             <w:tcMar>
               <w:top w:type="dxa" w:w="60"/>
@@ -18730,7 +18732,7 @@
         </w:tc>
         <w:tc>
           <w:tcPr>
-            <w:tcW w:type="dxa" w:w="2556"/>
+            <w:tcW w:type="dxa" w:w="2300"/>
             <w:shd w:fill="FFFFFF" w:color="auto" w:val="clear"/>
             <w:tcMar>
               <w:top w:type="dxa" w:w="60"/>
@@ -18849,7 +18851,7 @@
             <w:pPr>
               <w:spacing w:after="20" w:before="0"/>
             </w:pPr>
-            <w:hyperlink w:history="1" r:id="rIdob-3tkvkx-ccn7a6vobe4">
+            <w:hyperlink w:history="1" r:id="rIdp1hzzusryhi7gvfzuyb5j">
               <w:r>
                 <w:rPr>
                   <w:rFonts w:ascii="Arial" w:cs="Arial" w:eastAsia="Arial" w:hAnsi="Arial"/>
@@ -18882,7 +18884,7 @@
               <w:spacing w:after="10" w:before="0"/>
               <w:ind w:left="120"/>
             </w:pPr>
-            <w:hyperlink w:history="1" r:id="rIdxjeavu5jc8zxw6_ieovok">
+            <w:hyperlink w:history="1" r:id="rId89ksztkdkfyb9anfz6tdx">
               <w:r>
                 <w:rPr>
                   <w:rFonts w:ascii="Arial" w:cs="Arial" w:eastAsia="Arial" w:hAnsi="Arial"/>
@@ -18927,7 +18929,7 @@
             <w:pPr>
               <w:spacing w:after="20" w:before="0"/>
             </w:pPr>
-            <w:hyperlink w:history="1" r:id="rId9mzldzyq-1npotbyqkh5h">
+            <w:hyperlink w:history="1" r:id="rIdc3bixi2yfmrhla3rwwdue">
               <w:r>
                 <w:rPr>
                   <w:rFonts w:ascii="Arial" w:cs="Arial" w:eastAsia="Arial" w:hAnsi="Arial"/>
@@ -18960,7 +18962,7 @@
               <w:spacing w:after="10" w:before="0"/>
               <w:ind w:left="120"/>
             </w:pPr>
-            <w:hyperlink w:history="1" r:id="rId0go64tbzgrxoysapr9wy0">
+            <w:hyperlink w:history="1" r:id="rIdty0le6gfghkq-hgibuxnj">
               <w:r>
                 <w:rPr>
                   <w:rFonts w:ascii="Arial" w:cs="Arial" w:eastAsia="Arial" w:hAnsi="Arial"/>
@@ -18976,7 +18978,7 @@
         </w:tc>
         <w:tc>
           <w:tcPr>
-            <w:tcW w:type="dxa" w:w="2556"/>
+            <w:tcW w:type="dxa" w:w="3324"/>
             <w:shd w:fill="FFFFFF" w:color="auto" w:val="clear"/>
             <w:tcMar>
               <w:top w:type="dxa" w:w="60"/>
@@ -19046,7 +19048,7 @@
         </w:tc>
         <w:tc>
           <w:tcPr>
-            <w:tcW w:type="dxa" w:w="2556"/>
+            <w:tcW w:type="dxa" w:w="2300"/>
             <w:shd w:fill="F2F2F2" w:color="auto" w:val="clear"/>
             <w:tcMar>
               <w:top w:type="dxa" w:w="60"/>
@@ -19097,7 +19099,7 @@
         </w:tc>
         <w:tc>
           <w:tcPr>
-            <w:tcW w:type="dxa" w:w="2556"/>
+            <w:tcW w:type="dxa" w:w="2300"/>
             <w:shd w:fill="FFFFFF" w:color="auto" w:val="clear"/>
             <w:tcMar>
               <w:top w:type="dxa" w:w="60"/>
@@ -19182,7 +19184,7 @@
         </w:tc>
         <w:tc>
           <w:tcPr>
-            <w:tcW w:type="dxa" w:w="2556"/>
+            <w:tcW w:type="dxa" w:w="2300"/>
             <w:shd w:fill="FFFFFF" w:color="auto" w:val="clear"/>
             <w:tcMar>
               <w:top w:type="dxa" w:w="60"/>
@@ -19263,7 +19265,7 @@
             <w:pPr>
               <w:spacing w:after="20" w:before="0"/>
             </w:pPr>
-            <w:hyperlink w:history="1" r:id="rIdevbmaq8zlx_qg1v_8zkdj">
+            <w:hyperlink w:history="1" r:id="rIdvtjyypuadwz4irkrau-ak">
               <w:r>
                 <w:rPr>
                   <w:rFonts w:ascii="Arial" w:cs="Arial" w:eastAsia="Arial" w:hAnsi="Arial"/>
@@ -19296,7 +19298,7 @@
               <w:spacing w:after="10" w:before="0"/>
               <w:ind w:left="120"/>
             </w:pPr>
-            <w:hyperlink w:history="1" r:id="rId5m0m0a8eksogs-4ew7i6j">
+            <w:hyperlink w:history="1" r:id="rId9yogydaik6ezcogkjtt4k">
               <w:r>
                 <w:rPr>
                   <w:rFonts w:ascii="Arial" w:cs="Arial" w:eastAsia="Arial" w:hAnsi="Arial"/>
@@ -19341,7 +19343,7 @@
             <w:pPr>
               <w:spacing w:after="20" w:before="0"/>
             </w:pPr>
-            <w:hyperlink w:history="1" r:id="rIdqom6bfi_7bv8z49rsehdh">
+            <w:hyperlink w:history="1" r:id="rIdgex2cqnkwr-wkleitheir">
               <w:r>
                 <w:rPr>
                   <w:rFonts w:ascii="Arial" w:cs="Arial" w:eastAsia="Arial" w:hAnsi="Arial"/>
@@ -19374,7 +19376,7 @@
               <w:spacing w:after="10" w:before="0"/>
               <w:ind w:left="120"/>
             </w:pPr>
-            <w:hyperlink w:history="1" r:id="rIdzzpo-bzh0eh1nqa_e15uw">
+            <w:hyperlink w:history="1" r:id="rIdjzq19v7d_itabqnlljqfc">
               <w:r>
                 <w:rPr>
                   <w:rFonts w:ascii="Arial" w:cs="Arial" w:eastAsia="Arial" w:hAnsi="Arial"/>
@@ -19390,7 +19392,7 @@
         </w:tc>
         <w:tc>
           <w:tcPr>
-            <w:tcW w:type="dxa" w:w="2556"/>
+            <w:tcW w:type="dxa" w:w="3324"/>
             <w:shd w:fill="FFFFFF" w:color="auto" w:val="clear"/>
             <w:tcMar>
               <w:top w:type="dxa" w:w="60"/>
@@ -19460,7 +19462,7 @@
         </w:tc>
         <w:tc>
           <w:tcPr>
-            <w:tcW w:type="dxa" w:w="2556"/>
+            <w:tcW w:type="dxa" w:w="2300"/>
             <w:shd w:fill="F2F2F2" w:color="auto" w:val="clear"/>
             <w:tcMar>
               <w:top w:type="dxa" w:w="60"/>
@@ -19511,7 +19513,7 @@
         </w:tc>
         <w:tc>
           <w:tcPr>
-            <w:tcW w:type="dxa" w:w="2556"/>
+            <w:tcW w:type="dxa" w:w="2300"/>
             <w:shd w:fill="FFFFFF" w:color="auto" w:val="clear"/>
             <w:tcMar>
               <w:top w:type="dxa" w:w="60"/>
@@ -19596,7 +19598,7 @@
         </w:tc>
         <w:tc>
           <w:tcPr>
-            <w:tcW w:type="dxa" w:w="2556"/>
+            <w:tcW w:type="dxa" w:w="2300"/>
             <w:shd w:fill="FFFFFF" w:color="auto" w:val="clear"/>
             <w:tcMar>
               <w:top w:type="dxa" w:w="60"/>
@@ -19658,7 +19660,7 @@
             <w:pPr>
               <w:spacing w:after="20" w:before="0"/>
             </w:pPr>
-            <w:hyperlink w:history="1" r:id="rIdm6ezo6przs8vpavrm81wt">
+            <w:hyperlink w:history="1" r:id="rIduysqjfnqlnts-qybe8aoa">
               <w:r>
                 <w:rPr>
                   <w:rFonts w:ascii="Arial" w:cs="Arial" w:eastAsia="Arial" w:hAnsi="Arial"/>
@@ -19691,7 +19693,7 @@
               <w:spacing w:after="10" w:before="0"/>
               <w:ind w:left="120"/>
             </w:pPr>
-            <w:hyperlink w:history="1" r:id="rIdtjiztddwrferv_nqv1fan">
+            <w:hyperlink w:history="1" r:id="rIdkp6lv-vvwcjxllsy1rhv-">
               <w:r>
                 <w:rPr>
                   <w:rFonts w:ascii="Arial" w:cs="Arial" w:eastAsia="Arial" w:hAnsi="Arial"/>
@@ -19736,7 +19738,7 @@
             <w:pPr>
               <w:spacing w:after="20" w:before="0"/>
             </w:pPr>
-            <w:hyperlink w:history="1" r:id="rIdsi68rtmnbjcg77vpk0iwf">
+            <w:hyperlink w:history="1" r:id="rIdpt5wdmoeimspedd2dicqs">
               <w:r>
                 <w:rPr>
                   <w:rFonts w:ascii="Arial" w:cs="Arial" w:eastAsia="Arial" w:hAnsi="Arial"/>
@@ -19769,7 +19771,7 @@
               <w:spacing w:after="10" w:before="0"/>
               <w:ind w:left="120"/>
             </w:pPr>
-            <w:hyperlink w:history="1" r:id="rId3gu5vt9gxofc8bnmjep9b">
+            <w:hyperlink w:history="1" r:id="rIdatpgwonh6o_2-7iboymyb">
               <w:r>
                 <w:rPr>
                   <w:rFonts w:ascii="Arial" w:cs="Arial" w:eastAsia="Arial" w:hAnsi="Arial"/>
@@ -19785,7 +19787,7 @@
         </w:tc>
         <w:tc>
           <w:tcPr>
-            <w:tcW w:type="dxa" w:w="2556"/>
+            <w:tcW w:type="dxa" w:w="3324"/>
             <w:shd w:fill="FFFFFF" w:color="auto" w:val="clear"/>
             <w:tcMar>
               <w:top w:type="dxa" w:w="60"/>
@@ -19836,7 +19838,7 @@
         </w:tc>
         <w:tc>
           <w:tcPr>
-            <w:tcW w:type="dxa" w:w="2556"/>
+            <w:tcW w:type="dxa" w:w="2300"/>
             <w:shd w:fill="F2F2F2" w:color="auto" w:val="clear"/>
             <w:tcMar>
               <w:top w:type="dxa" w:w="60"/>
@@ -19868,7 +19870,7 @@
         </w:tc>
         <w:tc>
           <w:tcPr>
-            <w:tcW w:type="dxa" w:w="2556"/>
+            <w:tcW w:type="dxa" w:w="2300"/>
             <w:shd w:fill="FFFFFF" w:color="auto" w:val="clear"/>
             <w:tcMar>
               <w:top w:type="dxa" w:w="60"/>
@@ -19934,7 +19936,7 @@
         </w:tc>
         <w:tc>
           <w:tcPr>
-            <w:tcW w:type="dxa" w:w="2556"/>
+            <w:tcW w:type="dxa" w:w="2300"/>
             <w:shd w:fill="FFFFFF" w:color="auto" w:val="clear"/>
             <w:tcMar>
               <w:top w:type="dxa" w:w="60"/>
@@ -19996,7 +19998,7 @@
             <w:pPr>
               <w:spacing w:after="20" w:before="0"/>
             </w:pPr>
-            <w:hyperlink w:history="1" r:id="rIdoefls4tj1cls5lntjcora">
+            <w:hyperlink w:history="1" r:id="rIdot-iafk_bejsklvzphjn9">
               <w:r>
                 <w:rPr>
                   <w:rFonts w:ascii="Arial" w:cs="Arial" w:eastAsia="Arial" w:hAnsi="Arial"/>
@@ -20029,7 +20031,7 @@
               <w:spacing w:after="10" w:before="0"/>
               <w:ind w:left="120"/>
             </w:pPr>
-            <w:hyperlink w:history="1" r:id="rIdmdn74768w7b6nk2jpz77r">
+            <w:hyperlink w:history="1" r:id="rIdozpjiz7muxkmg6bu1eyxp">
               <w:r>
                 <w:rPr>
                   <w:rFonts w:ascii="Arial" w:cs="Arial" w:eastAsia="Arial" w:hAnsi="Arial"/>
@@ -20074,7 +20076,7 @@
             <w:pPr>
               <w:spacing w:after="20" w:before="0"/>
             </w:pPr>
-            <w:hyperlink w:history="1" r:id="rId1excwsp9smai5sqfdgimq">
+            <w:hyperlink w:history="1" r:id="rIdze8q-tq2jtd7xsqsrv-c8">
               <w:r>
                 <w:rPr>
                   <w:rFonts w:ascii="Arial" w:cs="Arial" w:eastAsia="Arial" w:hAnsi="Arial"/>
@@ -20107,7 +20109,7 @@
               <w:spacing w:after="10" w:before="0"/>
               <w:ind w:left="120"/>
             </w:pPr>
-            <w:hyperlink w:history="1" r:id="rIdugjjz8mpsfhzsoucbobgt">
+            <w:hyperlink w:history="1" r:id="rIdiqzlrmlh5lubxkvmrxkic">
               <w:r>
                 <w:rPr>
                   <w:rFonts w:ascii="Arial" w:cs="Arial" w:eastAsia="Arial" w:hAnsi="Arial"/>
@@ -20123,7 +20125,7 @@
         </w:tc>
         <w:tc>
           <w:tcPr>
-            <w:tcW w:type="dxa" w:w="2556"/>
+            <w:tcW w:type="dxa" w:w="3324"/>
             <w:shd w:fill="FFFFFF" w:color="auto" w:val="clear"/>
             <w:tcMar>
               <w:top w:type="dxa" w:w="60"/>
@@ -20174,7 +20176,7 @@
         </w:tc>
         <w:tc>
           <w:tcPr>
-            <w:tcW w:type="dxa" w:w="2556"/>
+            <w:tcW w:type="dxa" w:w="2300"/>
             <w:shd w:fill="F2F2F2" w:color="auto" w:val="clear"/>
             <w:tcMar>
               <w:top w:type="dxa" w:w="60"/>
@@ -20206,7 +20208,7 @@
         </w:tc>
         <w:tc>
           <w:tcPr>
-            <w:tcW w:type="dxa" w:w="2556"/>
+            <w:tcW w:type="dxa" w:w="2300"/>
             <w:shd w:fill="FFFFFF" w:color="auto" w:val="clear"/>
             <w:tcMar>
               <w:top w:type="dxa" w:w="60"/>
@@ -21747,11 +21749,11 @@
       </w:tblPr>
       <w:tblGrid>
         <w:gridCol w:w="900"/>
+        <w:gridCol w:w="2300"/>
         <w:gridCol w:w="2556"/>
-        <w:gridCol w:w="2556"/>
-        <w:gridCol w:w="2556"/>
-        <w:gridCol w:w="2556"/>
-        <w:gridCol w:w="2556"/>
+        <w:gridCol w:w="3324"/>
+        <w:gridCol w:w="2300"/>
+        <w:gridCol w:w="2300"/>
       </w:tblGrid>
       <w:tr>
         <w:tc>
@@ -21823,7 +21825,7 @@
         </w:tc>
         <w:tc>
           <w:tcPr>
-            <w:tcW w:type="dxa" w:w="2556"/>
+            <w:tcW w:type="dxa" w:w="2300"/>
             <w:shd w:fill="2E75B6" w:color="auto" w:val="clear"/>
             <w:tcMar>
               <w:top w:type="dxa" w:w="60"/>
@@ -21887,7 +21889,7 @@
         </w:tc>
         <w:tc>
           <w:tcPr>
-            <w:tcW w:type="dxa" w:w="2556"/>
+            <w:tcW w:type="dxa" w:w="3324"/>
             <w:shd w:fill="2E75B6" w:color="auto" w:val="clear"/>
             <w:tcMar>
               <w:top w:type="dxa" w:w="60"/>
@@ -21919,7 +21921,7 @@
         </w:tc>
         <w:tc>
           <w:tcPr>
-            <w:tcW w:type="dxa" w:w="2556"/>
+            <w:tcW w:type="dxa" w:w="2300"/>
             <w:shd w:fill="1F6B75" w:color="auto" w:val="clear"/>
             <w:tcMar>
               <w:top w:type="dxa" w:w="60"/>
@@ -21951,7 +21953,7 @@
         </w:tc>
         <w:tc>
           <w:tcPr>
-            <w:tcW w:type="dxa" w:w="2556"/>
+            <w:tcW w:type="dxa" w:w="2300"/>
             <w:shd w:fill="2E75B6" w:color="auto" w:val="clear"/>
             <w:tcMar>
               <w:top w:type="dxa" w:w="60"/>
@@ -22017,7 +22019,7 @@
         </w:tc>
         <w:tc>
           <w:tcPr>
-            <w:tcW w:type="dxa" w:w="2556"/>
+            <w:tcW w:type="dxa" w:w="2300"/>
             <w:shd w:fill="FFFFFF" w:color="auto" w:val="clear"/>
             <w:tcMar>
               <w:top w:type="dxa" w:w="60"/>
@@ -22117,7 +22119,7 @@
             <w:pPr>
               <w:spacing w:after="20" w:before="0"/>
             </w:pPr>
-            <w:hyperlink w:history="1" r:id="rIdiovy0ghxwqdzkkt52-cdb">
+            <w:hyperlink w:history="1" r:id="rIdxz0_4r0mwtcc4vbzxo9r4">
               <w:r>
                 <w:rPr>
                   <w:rFonts w:ascii="Arial" w:cs="Arial" w:eastAsia="Arial" w:hAnsi="Arial"/>
@@ -22150,7 +22152,7 @@
               <w:spacing w:after="10" w:before="0"/>
               <w:ind w:left="120"/>
             </w:pPr>
-            <w:hyperlink w:history="1" r:id="rIdlm8k2gqsj4_8cjrbkeuzp">
+            <w:hyperlink w:history="1" r:id="rIdw8vohv6hqk2ar4je8qnab">
               <w:r>
                 <w:rPr>
                   <w:rFonts w:ascii="Arial" w:cs="Arial" w:eastAsia="Arial" w:hAnsi="Arial"/>
@@ -22195,7 +22197,7 @@
             <w:pPr>
               <w:spacing w:after="20" w:before="0"/>
             </w:pPr>
-            <w:hyperlink w:history="1" r:id="rIdiydz6pfoaw5dj0k5oyh9x">
+            <w:hyperlink w:history="1" r:id="rIdy77tow9eo17lgkuy7ms3h">
               <w:r>
                 <w:rPr>
                   <w:rFonts w:ascii="Arial" w:cs="Arial" w:eastAsia="Arial" w:hAnsi="Arial"/>
@@ -22228,7 +22230,7 @@
               <w:spacing w:after="10" w:before="0"/>
               <w:ind w:left="120"/>
             </w:pPr>
-            <w:hyperlink w:history="1" r:id="rIdomyiijc69-pquwhdezgfm">
+            <w:hyperlink w:history="1" r:id="rIdt-fpc9aytqmva4vx5evb6">
               <w:r>
                 <w:rPr>
                   <w:rFonts w:ascii="Arial" w:cs="Arial" w:eastAsia="Arial" w:hAnsi="Arial"/>
@@ -22244,7 +22246,7 @@
         </w:tc>
         <w:tc>
           <w:tcPr>
-            <w:tcW w:type="dxa" w:w="2556"/>
+            <w:tcW w:type="dxa" w:w="3324"/>
             <w:shd w:fill="FFFFFF" w:color="auto" w:val="clear"/>
             <w:tcMar>
               <w:top w:type="dxa" w:w="60"/>
@@ -22314,7 +22316,7 @@
         </w:tc>
         <w:tc>
           <w:tcPr>
-            <w:tcW w:type="dxa" w:w="2556"/>
+            <w:tcW w:type="dxa" w:w="2300"/>
             <w:shd w:fill="F2F2F2" w:color="auto" w:val="clear"/>
             <w:tcMar>
               <w:top w:type="dxa" w:w="60"/>
@@ -22365,7 +22367,7 @@
         </w:tc>
         <w:tc>
           <w:tcPr>
-            <w:tcW w:type="dxa" w:w="2556"/>
+            <w:tcW w:type="dxa" w:w="2300"/>
             <w:shd w:fill="FFFFFF" w:color="auto" w:val="clear"/>
             <w:tcMar>
               <w:top w:type="dxa" w:w="60"/>
@@ -22450,7 +22452,7 @@
         </w:tc>
         <w:tc>
           <w:tcPr>
-            <w:tcW w:type="dxa" w:w="2556"/>
+            <w:tcW w:type="dxa" w:w="2300"/>
             <w:shd w:fill="FFFFFF" w:color="auto" w:val="clear"/>
             <w:tcMar>
               <w:top w:type="dxa" w:w="60"/>
@@ -22630,7 +22632,7 @@
             <w:pPr>
               <w:spacing w:after="20" w:before="0"/>
             </w:pPr>
-            <w:hyperlink w:history="1" r:id="rIdct-1sfssztvlxh589wicj">
+            <w:hyperlink w:history="1" r:id="rIdk1pedlvjqio7ktomyguey">
               <w:r>
                 <w:rPr>
                   <w:rFonts w:ascii="Arial" w:cs="Arial" w:eastAsia="Arial" w:hAnsi="Arial"/>
@@ -22663,7 +22665,7 @@
               <w:spacing w:after="10" w:before="0"/>
               <w:ind w:left="120"/>
             </w:pPr>
-            <w:hyperlink w:history="1" r:id="rId2bt_92iaqukankjwsak_b">
+            <w:hyperlink w:history="1" r:id="rIddos8g8fg5yqp4_8hy5m0w">
               <w:r>
                 <w:rPr>
                   <w:rFonts w:ascii="Arial" w:cs="Arial" w:eastAsia="Arial" w:hAnsi="Arial"/>
@@ -22708,7 +22710,7 @@
             <w:pPr>
               <w:spacing w:after="20" w:before="0"/>
             </w:pPr>
-            <w:hyperlink w:history="1" r:id="rIdybkq6gnx4lwvzc_8mnl8q">
+            <w:hyperlink w:history="1" r:id="rIdc8uh5sjvqewrus8qkwgvb">
               <w:r>
                 <w:rPr>
                   <w:rFonts w:ascii="Arial" w:cs="Arial" w:eastAsia="Arial" w:hAnsi="Arial"/>
@@ -22741,7 +22743,7 @@
               <w:spacing w:after="10" w:before="0"/>
               <w:ind w:left="120"/>
             </w:pPr>
-            <w:hyperlink w:history="1" r:id="rIdg4i4hd4e9uubt3oqaxqtk">
+            <w:hyperlink w:history="1" r:id="rIdi1sqmmgyttx3xsmp3q943">
               <w:r>
                 <w:rPr>
                   <w:rFonts w:ascii="Arial" w:cs="Arial" w:eastAsia="Arial" w:hAnsi="Arial"/>
@@ -22757,7 +22759,7 @@
         </w:tc>
         <w:tc>
           <w:tcPr>
-            <w:tcW w:type="dxa" w:w="2556"/>
+            <w:tcW w:type="dxa" w:w="3324"/>
             <w:shd w:fill="FFFFFF" w:color="auto" w:val="clear"/>
             <w:tcMar>
               <w:top w:type="dxa" w:w="60"/>
@@ -22827,7 +22829,7 @@
         </w:tc>
         <w:tc>
           <w:tcPr>
-            <w:tcW w:type="dxa" w:w="2556"/>
+            <w:tcW w:type="dxa" w:w="2300"/>
             <w:shd w:fill="F2F2F2" w:color="auto" w:val="clear"/>
             <w:tcMar>
               <w:top w:type="dxa" w:w="60"/>
@@ -22878,7 +22880,7 @@
         </w:tc>
         <w:tc>
           <w:tcPr>
-            <w:tcW w:type="dxa" w:w="2556"/>
+            <w:tcW w:type="dxa" w:w="2300"/>
             <w:shd w:fill="FFFFFF" w:color="auto" w:val="clear"/>
             <w:tcMar>
               <w:top w:type="dxa" w:w="60"/>
@@ -22982,7 +22984,7 @@
         </w:tc>
         <w:tc>
           <w:tcPr>
-            <w:tcW w:type="dxa" w:w="2556"/>
+            <w:tcW w:type="dxa" w:w="2300"/>
             <w:shd w:fill="FFFFFF" w:color="auto" w:val="clear"/>
             <w:tcMar>
               <w:top w:type="dxa" w:w="60"/>
@@ -23101,7 +23103,7 @@
             <w:pPr>
               <w:spacing w:after="20" w:before="0"/>
             </w:pPr>
-            <w:hyperlink w:history="1" r:id="rId_dbdhkdak9hoqkqtpe4iq">
+            <w:hyperlink w:history="1" r:id="rIdv5egukzbu2wdjrsxmgs9c">
               <w:r>
                 <w:rPr>
                   <w:rFonts w:ascii="Arial" w:cs="Arial" w:eastAsia="Arial" w:hAnsi="Arial"/>
@@ -23134,7 +23136,7 @@
               <w:spacing w:after="10" w:before="0"/>
               <w:ind w:left="120"/>
             </w:pPr>
-            <w:hyperlink w:history="1" r:id="rId9dze--gonlrao19re1yqc">
+            <w:hyperlink w:history="1" r:id="rIdjyv1gbia1qs84yozcctiu">
               <w:r>
                 <w:rPr>
                   <w:rFonts w:ascii="Arial" w:cs="Arial" w:eastAsia="Arial" w:hAnsi="Arial"/>
@@ -23179,7 +23181,7 @@
             <w:pPr>
               <w:spacing w:after="20" w:before="0"/>
             </w:pPr>
-            <w:hyperlink w:history="1" r:id="rIdju48dhtay6k3m4oraivyy">
+            <w:hyperlink w:history="1" r:id="rIdlj24ytu_u4uixuob7avei">
               <w:r>
                 <w:rPr>
                   <w:rFonts w:ascii="Arial" w:cs="Arial" w:eastAsia="Arial" w:hAnsi="Arial"/>
@@ -23212,7 +23214,7 @@
               <w:spacing w:after="10" w:before="0"/>
               <w:ind w:left="120"/>
             </w:pPr>
-            <w:hyperlink w:history="1" r:id="rIdhfvmnmcu6y5xfk1-bsyer">
+            <w:hyperlink w:history="1" r:id="rIdb3t8qe-l2u-kn1j1iywi4">
               <w:r>
                 <w:rPr>
                   <w:rFonts w:ascii="Arial" w:cs="Arial" w:eastAsia="Arial" w:hAnsi="Arial"/>
@@ -23228,7 +23230,7 @@
         </w:tc>
         <w:tc>
           <w:tcPr>
-            <w:tcW w:type="dxa" w:w="2556"/>
+            <w:tcW w:type="dxa" w:w="3324"/>
             <w:shd w:fill="FFFFFF" w:color="auto" w:val="clear"/>
             <w:tcMar>
               <w:top w:type="dxa" w:w="60"/>
@@ -23298,7 +23300,7 @@
         </w:tc>
         <w:tc>
           <w:tcPr>
-            <w:tcW w:type="dxa" w:w="2556"/>
+            <w:tcW w:type="dxa" w:w="2300"/>
             <w:shd w:fill="F2F2F2" w:color="auto" w:val="clear"/>
             <w:tcMar>
               <w:top w:type="dxa" w:w="60"/>
@@ -23330,7 +23332,7 @@
         </w:tc>
         <w:tc>
           <w:tcPr>
-            <w:tcW w:type="dxa" w:w="2556"/>
+            <w:tcW w:type="dxa" w:w="2300"/>
             <w:shd w:fill="FFFFFF" w:color="auto" w:val="clear"/>
             <w:tcMar>
               <w:top w:type="dxa" w:w="60"/>
@@ -23415,7 +23417,7 @@
         </w:tc>
         <w:tc>
           <w:tcPr>
-            <w:tcW w:type="dxa" w:w="2556"/>
+            <w:tcW w:type="dxa" w:w="2300"/>
             <w:shd w:fill="FFFFFF" w:color="auto" w:val="clear"/>
             <w:tcMar>
               <w:top w:type="dxa" w:w="60"/>
@@ -23553,7 +23555,7 @@
             <w:pPr>
               <w:spacing w:after="20" w:before="0"/>
             </w:pPr>
-            <w:hyperlink w:history="1" r:id="rIddkzkhivyiss7ogx9x5pdv">
+            <w:hyperlink w:history="1" r:id="rIdh9u6glcqqwmyyyjev9ll9">
               <w:r>
                 <w:rPr>
                   <w:rFonts w:ascii="Arial" w:cs="Arial" w:eastAsia="Arial" w:hAnsi="Arial"/>
@@ -23586,7 +23588,7 @@
               <w:spacing w:after="10" w:before="0"/>
               <w:ind w:left="120"/>
             </w:pPr>
-            <w:hyperlink w:history="1" r:id="rId7oql3erpvaz6mrpklc0su">
+            <w:hyperlink w:history="1" r:id="rIdnpcvlk9j7iabvkuyy78ps">
               <w:r>
                 <w:rPr>
                   <w:rFonts w:ascii="Arial" w:cs="Arial" w:eastAsia="Arial" w:hAnsi="Arial"/>
@@ -23631,7 +23633,7 @@
             <w:pPr>
               <w:spacing w:after="20" w:before="0"/>
             </w:pPr>
-            <w:hyperlink w:history="1" r:id="rIdd0cwmukizr8q16r-pt8tl">
+            <w:hyperlink w:history="1" r:id="rIdxvywpm6buz7mqdq7o2dgq">
               <w:r>
                 <w:rPr>
                   <w:rFonts w:ascii="Arial" w:cs="Arial" w:eastAsia="Arial" w:hAnsi="Arial"/>
@@ -23664,7 +23666,7 @@
               <w:spacing w:after="10" w:before="0"/>
               <w:ind w:left="120"/>
             </w:pPr>
-            <w:hyperlink w:history="1" r:id="rId5d-vcu_fznuxzsawktggs">
+            <w:hyperlink w:history="1" r:id="rIdt0jp0_7kue9_yfcdbinvv">
               <w:r>
                 <w:rPr>
                   <w:rFonts w:ascii="Arial" w:cs="Arial" w:eastAsia="Arial" w:hAnsi="Arial"/>
@@ -23680,7 +23682,7 @@
         </w:tc>
         <w:tc>
           <w:tcPr>
-            <w:tcW w:type="dxa" w:w="2556"/>
+            <w:tcW w:type="dxa" w:w="3324"/>
             <w:shd w:fill="FFFFFF" w:color="auto" w:val="clear"/>
             <w:tcMar>
               <w:top w:type="dxa" w:w="60"/>
@@ -23750,7 +23752,7 @@
         </w:tc>
         <w:tc>
           <w:tcPr>
-            <w:tcW w:type="dxa" w:w="2556"/>
+            <w:tcW w:type="dxa" w:w="2300"/>
             <w:shd w:fill="F2F2F2" w:color="auto" w:val="clear"/>
             <w:tcMar>
               <w:top w:type="dxa" w:w="60"/>
@@ -23782,7 +23784,7 @@
         </w:tc>
         <w:tc>
           <w:tcPr>
-            <w:tcW w:type="dxa" w:w="2556"/>
+            <w:tcW w:type="dxa" w:w="2300"/>
             <w:shd w:fill="FFFFFF" w:color="auto" w:val="clear"/>
             <w:tcMar>
               <w:top w:type="dxa" w:w="60"/>
@@ -23848,7 +23850,7 @@
         </w:tc>
         <w:tc>
           <w:tcPr>
-            <w:tcW w:type="dxa" w:w="2556"/>
+            <w:tcW w:type="dxa" w:w="2300"/>
             <w:shd w:fill="FFFFFF" w:color="auto" w:val="clear"/>
             <w:tcMar>
               <w:top w:type="dxa" w:w="60"/>
@@ -23948,7 +23950,7 @@
             <w:pPr>
               <w:spacing w:after="20" w:before="0"/>
             </w:pPr>
-            <w:hyperlink w:history="1" r:id="rIdofoxahjsxd2cvjsn7gijd">
+            <w:hyperlink w:history="1" r:id="rIdxyavmzrkikx3ltxclfca5">
               <w:r>
                 <w:rPr>
                   <w:rFonts w:ascii="Arial" w:cs="Arial" w:eastAsia="Arial" w:hAnsi="Arial"/>
@@ -23981,7 +23983,7 @@
               <w:spacing w:after="10" w:before="0"/>
               <w:ind w:left="120"/>
             </w:pPr>
-            <w:hyperlink w:history="1" r:id="rIdmcqt2oi-yxmxq9oa1a-y5">
+            <w:hyperlink w:history="1" r:id="rId1fmuz3fqevqlyw7uislcb">
               <w:r>
                 <w:rPr>
                   <w:rFonts w:ascii="Arial" w:cs="Arial" w:eastAsia="Arial" w:hAnsi="Arial"/>
@@ -24026,7 +24028,7 @@
             <w:pPr>
               <w:spacing w:after="20" w:before="0"/>
             </w:pPr>
-            <w:hyperlink w:history="1" r:id="rId4d4sboocgwagpkzlnlhtj">
+            <w:hyperlink w:history="1" r:id="rIdje9upmujvataktuztl_jo">
               <w:r>
                 <w:rPr>
                   <w:rFonts w:ascii="Arial" w:cs="Arial" w:eastAsia="Arial" w:hAnsi="Arial"/>
@@ -24059,7 +24061,7 @@
               <w:spacing w:after="10" w:before="0"/>
               <w:ind w:left="120"/>
             </w:pPr>
-            <w:hyperlink w:history="1" r:id="rIdfdjsxlcsuv98zchxeoymi">
+            <w:hyperlink w:history="1" r:id="rIdcdxo5vrtcklqaahkloy8s">
               <w:r>
                 <w:rPr>
                   <w:rFonts w:ascii="Arial" w:cs="Arial" w:eastAsia="Arial" w:hAnsi="Arial"/>
@@ -24075,7 +24077,7 @@
         </w:tc>
         <w:tc>
           <w:tcPr>
-            <w:tcW w:type="dxa" w:w="2556"/>
+            <w:tcW w:type="dxa" w:w="3324"/>
             <w:shd w:fill="FFFFFF" w:color="auto" w:val="clear"/>
             <w:tcMar>
               <w:top w:type="dxa" w:w="60"/>
@@ -24145,7 +24147,7 @@
         </w:tc>
         <w:tc>
           <w:tcPr>
-            <w:tcW w:type="dxa" w:w="2556"/>
+            <w:tcW w:type="dxa" w:w="2300"/>
             <w:shd w:fill="F2F2F2" w:color="auto" w:val="clear"/>
             <w:tcMar>
               <w:top w:type="dxa" w:w="60"/>
@@ -24177,7 +24179,7 @@
         </w:tc>
         <w:tc>
           <w:tcPr>
-            <w:tcW w:type="dxa" w:w="2556"/>
+            <w:tcW w:type="dxa" w:w="2300"/>
             <w:shd w:fill="FFFFFF" w:color="auto" w:val="clear"/>
             <w:tcMar>
               <w:top w:type="dxa" w:w="60"/>

</xml_diff>

<commit_message>
Section C 5-column layout; lesson number typed as integer; docs point to main
</commit_message>
<xml_diff>
--- a/data/outputs/docx/Grade 10 Bio/Bio 1.1/Biology_Introduction_CBE_LessonSequence.docx
+++ b/data/outputs/docx/Grade 10 Bio/Bio 1.1/Biology_Introduction_CBE_LessonSequence.docx
@@ -3592,7 +3592,7 @@
             <w:pPr>
               <w:spacing w:after="20" w:before="0"/>
             </w:pPr>
-            <w:hyperlink w:history="1" r:id="rIdkozwknfehyb6754qoeh7d">
+            <w:hyperlink w:history="1" r:id="rId5fr2mtjkw2kisdaiqdvjk">
               <w:r>
                 <w:rPr>
                   <w:rFonts w:ascii="Arial" w:cs="Arial" w:eastAsia="Arial" w:hAnsi="Arial"/>
@@ -3625,7 +3625,7 @@
               <w:spacing w:after="10" w:before="0"/>
               <w:ind w:left="120"/>
             </w:pPr>
-            <w:hyperlink w:history="1" r:id="rIddrk1ixbihtqzfajtwtryo">
+            <w:hyperlink w:history="1" r:id="rId5kfukecldj2tunf72m09f">
               <w:r>
                 <w:rPr>
                   <w:rFonts w:ascii="Arial" w:cs="Arial" w:eastAsia="Arial" w:hAnsi="Arial"/>
@@ -3670,7 +3670,7 @@
             <w:pPr>
               <w:spacing w:after="20" w:before="0"/>
             </w:pPr>
-            <w:hyperlink w:history="1" r:id="rIde_8ffmxn6oeb2p7z8sraw">
+            <w:hyperlink w:history="1" r:id="rIdwficy4xqmgptpj3_nqzdb">
               <w:r>
                 <w:rPr>
                   <w:rFonts w:ascii="Arial" w:cs="Arial" w:eastAsia="Arial" w:hAnsi="Arial"/>
@@ -3703,7 +3703,7 @@
               <w:spacing w:after="10" w:before="0"/>
               <w:ind w:left="120"/>
             </w:pPr>
-            <w:hyperlink w:history="1" r:id="rIddvheyhmzfa-60dtyf_ve6">
+            <w:hyperlink w:history="1" r:id="rIdk_pbb6bsev52gdym0exvi">
               <w:r>
                 <w:rPr>
                   <w:rFonts w:ascii="Arial" w:cs="Arial" w:eastAsia="Arial" w:hAnsi="Arial"/>
@@ -4006,7 +4006,7 @@
             <w:pPr>
               <w:spacing w:after="20" w:before="0"/>
             </w:pPr>
-            <w:hyperlink w:history="1" r:id="rIdopjfks66m2xwsstswh91-">
+            <w:hyperlink w:history="1" r:id="rIdq6fukmzfvemik3ii_h6wv">
               <w:r>
                 <w:rPr>
                   <w:rFonts w:ascii="Arial" w:cs="Arial" w:eastAsia="Arial" w:hAnsi="Arial"/>
@@ -4039,7 +4039,7 @@
               <w:spacing w:after="10" w:before="0"/>
               <w:ind w:left="120"/>
             </w:pPr>
-            <w:hyperlink w:history="1" r:id="rIdkben-52cynw4qylvs2d4g">
+            <w:hyperlink w:history="1" r:id="rIdb-thl586q88nbegv9ixn_">
               <w:r>
                 <w:rPr>
                   <w:rFonts w:ascii="Arial" w:cs="Arial" w:eastAsia="Arial" w:hAnsi="Arial"/>
@@ -4084,7 +4084,7 @@
             <w:pPr>
               <w:spacing w:after="20" w:before="0"/>
             </w:pPr>
-            <w:hyperlink w:history="1" r:id="rIdf-rvlj_rujmx-qkd-ucm3">
+            <w:hyperlink w:history="1" r:id="rIdhwesav5dvqpwc9tb__4ie">
               <w:r>
                 <w:rPr>
                   <w:rFonts w:ascii="Arial" w:cs="Arial" w:eastAsia="Arial" w:hAnsi="Arial"/>
@@ -4117,7 +4117,7 @@
               <w:spacing w:after="10" w:before="0"/>
               <w:ind w:left="120"/>
             </w:pPr>
-            <w:hyperlink w:history="1" r:id="rIdw0_61p9xj44sqgyv3neup">
+            <w:hyperlink w:history="1" r:id="rIdqq5h0n5ofo9qtm9yird_z">
               <w:r>
                 <w:rPr>
                   <w:rFonts w:ascii="Arial" w:cs="Arial" w:eastAsia="Arial" w:hAnsi="Arial"/>
@@ -4420,7 +4420,7 @@
             <w:pPr>
               <w:spacing w:after="20" w:before="0"/>
             </w:pPr>
-            <w:hyperlink w:history="1" r:id="rIduopfpccdbyj2vfbwwxvhe">
+            <w:hyperlink w:history="1" r:id="rIdpwr0lyg1fjagsiew2fufp">
               <w:r>
                 <w:rPr>
                   <w:rFonts w:ascii="Arial" w:cs="Arial" w:eastAsia="Arial" w:hAnsi="Arial"/>
@@ -4453,7 +4453,7 @@
               <w:spacing w:after="10" w:before="0"/>
               <w:ind w:left="120"/>
             </w:pPr>
-            <w:hyperlink w:history="1" r:id="rIdtx3jp6-o60rlajnyftaql">
+            <w:hyperlink w:history="1" r:id="rIdfjht3-dagmdplmwrnrau5">
               <w:r>
                 <w:rPr>
                   <w:rFonts w:ascii="Arial" w:cs="Arial" w:eastAsia="Arial" w:hAnsi="Arial"/>
@@ -4498,7 +4498,7 @@
             <w:pPr>
               <w:spacing w:after="20" w:before="0"/>
             </w:pPr>
-            <w:hyperlink w:history="1" r:id="rIdeel6_4xj9n2i-t5ghq2g4">
+            <w:hyperlink w:history="1" r:id="rIdbeas_sajxvsrjznwiocgo">
               <w:r>
                 <w:rPr>
                   <w:rFonts w:ascii="Arial" w:cs="Arial" w:eastAsia="Arial" w:hAnsi="Arial"/>
@@ -4531,7 +4531,7 @@
               <w:spacing w:after="10" w:before="0"/>
               <w:ind w:left="120"/>
             </w:pPr>
-            <w:hyperlink w:history="1" r:id="rIdvxiecvas_t9gn9fjsi3g4">
+            <w:hyperlink w:history="1" r:id="rIdxdisztrdopz2xy1_uvz5d">
               <w:r>
                 <w:rPr>
                   <w:rFonts w:ascii="Arial" w:cs="Arial" w:eastAsia="Arial" w:hAnsi="Arial"/>
@@ -4815,7 +4815,7 @@
             <w:pPr>
               <w:spacing w:after="20" w:before="0"/>
             </w:pPr>
-            <w:hyperlink w:history="1" r:id="rIdvdai_pmkqe8nelwgmvan6">
+            <w:hyperlink w:history="1" r:id="rId04najtlabjcvybl5cpk_t">
               <w:r>
                 <w:rPr>
                   <w:rFonts w:ascii="Arial" w:cs="Arial" w:eastAsia="Arial" w:hAnsi="Arial"/>
@@ -4848,7 +4848,7 @@
               <w:spacing w:after="10" w:before="0"/>
               <w:ind w:left="120"/>
             </w:pPr>
-            <w:hyperlink w:history="1" r:id="rId6pgbsxbs6d22r0v6e6xq9">
+            <w:hyperlink w:history="1" r:id="rId-uvgztqawrj-1uov0hkqm">
               <w:r>
                 <w:rPr>
                   <w:rFonts w:ascii="Arial" w:cs="Arial" w:eastAsia="Arial" w:hAnsi="Arial"/>
@@ -4893,7 +4893,7 @@
             <w:pPr>
               <w:spacing w:after="20" w:before="0"/>
             </w:pPr>
-            <w:hyperlink w:history="1" r:id="rIdybrsa6tqdr8cylollqjzl">
+            <w:hyperlink w:history="1" r:id="rIdmiij5r1ticgassm8ucbe-">
               <w:r>
                 <w:rPr>
                   <w:rFonts w:ascii="Arial" w:cs="Arial" w:eastAsia="Arial" w:hAnsi="Arial"/>
@@ -4926,7 +4926,7 @@
               <w:spacing w:after="10" w:before="0"/>
               <w:ind w:left="120"/>
             </w:pPr>
-            <w:hyperlink w:history="1" r:id="rId_i5ejmhkwnosbotqakabj">
+            <w:hyperlink w:history="1" r:id="rIdutyojcickmpcrqhp8p1ny">
               <w:r>
                 <w:rPr>
                   <w:rFonts w:ascii="Arial" w:cs="Arial" w:eastAsia="Arial" w:hAnsi="Arial"/>
@@ -5248,7 +5248,7 @@
             <w:pPr>
               <w:spacing w:after="20" w:before="0"/>
             </w:pPr>
-            <w:hyperlink w:history="1" r:id="rIdphck_d0oq_kyphk0b9dfn">
+            <w:hyperlink w:history="1" r:id="rId5ngp1i86pqqa7mc0oz8ja">
               <w:r>
                 <w:rPr>
                   <w:rFonts w:ascii="Arial" w:cs="Arial" w:eastAsia="Arial" w:hAnsi="Arial"/>
@@ -5281,7 +5281,7 @@
               <w:spacing w:after="10" w:before="0"/>
               <w:ind w:left="120"/>
             </w:pPr>
-            <w:hyperlink w:history="1" r:id="rIdnemdsnywuvgcrx6btetjl">
+            <w:hyperlink w:history="1" r:id="rIdbgyzm4vhai8mlaawnabgh">
               <w:r>
                 <w:rPr>
                   <w:rFonts w:ascii="Arial" w:cs="Arial" w:eastAsia="Arial" w:hAnsi="Arial"/>
@@ -5326,7 +5326,7 @@
             <w:pPr>
               <w:spacing w:after="20" w:before="0"/>
             </w:pPr>
-            <w:hyperlink w:history="1" r:id="rIdcsc2tj8zfetcywxclxwp-">
+            <w:hyperlink w:history="1" r:id="rIdenwyhzw81azhxcoj4tnvn">
               <w:r>
                 <w:rPr>
                   <w:rFonts w:ascii="Arial" w:cs="Arial" w:eastAsia="Arial" w:hAnsi="Arial"/>
@@ -5359,7 +5359,7 @@
               <w:spacing w:after="10" w:before="0"/>
               <w:ind w:left="120"/>
             </w:pPr>
-            <w:hyperlink w:history="1" r:id="rIdlv-iuhklmonab1nn_3ttb">
+            <w:hyperlink w:history="1" r:id="rId6peedqc50bkz7yjiyfjdl">
               <w:r>
                 <w:rPr>
                   <w:rFonts w:ascii="Arial" w:cs="Arial" w:eastAsia="Arial" w:hAnsi="Arial"/>
@@ -7368,7 +7368,7 @@
             <w:pPr>
               <w:spacing w:after="20" w:before="0"/>
             </w:pPr>
-            <w:hyperlink w:history="1" r:id="rId6wlaca63ijjlk9glxoehq">
+            <w:hyperlink w:history="1" r:id="rIds3qfufcfcxr0ot2a8thdu">
               <w:r>
                 <w:rPr>
                   <w:rFonts w:ascii="Arial" w:cs="Arial" w:eastAsia="Arial" w:hAnsi="Arial"/>
@@ -7401,7 +7401,7 @@
               <w:spacing w:after="10" w:before="0"/>
               <w:ind w:left="120"/>
             </w:pPr>
-            <w:hyperlink w:history="1" r:id="rIdxzomkhht8n2w0k9ioajyr">
+            <w:hyperlink w:history="1" r:id="rIdh1ab7-xip5vwqulhorjij">
               <w:r>
                 <w:rPr>
                   <w:rFonts w:ascii="Arial" w:cs="Arial" w:eastAsia="Arial" w:hAnsi="Arial"/>
@@ -7446,7 +7446,7 @@
             <w:pPr>
               <w:spacing w:after="20" w:before="0"/>
             </w:pPr>
-            <w:hyperlink w:history="1" r:id="rIdsrignh-f7_vtx6o_vxd5v">
+            <w:hyperlink w:history="1" r:id="rIdp_vzl-im0kfbdh-ie9fid">
               <w:r>
                 <w:rPr>
                   <w:rFonts w:ascii="Arial" w:cs="Arial" w:eastAsia="Arial" w:hAnsi="Arial"/>
@@ -7479,7 +7479,7 @@
               <w:spacing w:after="10" w:before="0"/>
               <w:ind w:left="120"/>
             </w:pPr>
-            <w:hyperlink w:history="1" r:id="rIdkc-dqjk4l_krme3cubqky">
+            <w:hyperlink w:history="1" r:id="rIdz4ruqhask6y0lo3mdvici">
               <w:r>
                 <w:rPr>
                   <w:rFonts w:ascii="Arial" w:cs="Arial" w:eastAsia="Arial" w:hAnsi="Arial"/>
@@ -7763,7 +7763,7 @@
             <w:pPr>
               <w:spacing w:after="20" w:before="0"/>
             </w:pPr>
-            <w:hyperlink w:history="1" r:id="rIdrrpqbzmorcv0fqhb68zv5">
+            <w:hyperlink w:history="1" r:id="rIdl5fkiqexmlxcwyhkaqz_g">
               <w:r>
                 <w:rPr>
                   <w:rFonts w:ascii="Arial" w:cs="Arial" w:eastAsia="Arial" w:hAnsi="Arial"/>
@@ -7796,7 +7796,7 @@
               <w:spacing w:after="10" w:before="0"/>
               <w:ind w:left="120"/>
             </w:pPr>
-            <w:hyperlink w:history="1" r:id="rId0--binvuxn21_4ew2dt9m">
+            <w:hyperlink w:history="1" r:id="rIdrs_n0numpmss_jmc_oiit">
               <w:r>
                 <w:rPr>
                   <w:rFonts w:ascii="Arial" w:cs="Arial" w:eastAsia="Arial" w:hAnsi="Arial"/>
@@ -7841,7 +7841,7 @@
             <w:pPr>
               <w:spacing w:after="20" w:before="0"/>
             </w:pPr>
-            <w:hyperlink w:history="1" r:id="rIdizjizctpz43phnnc-w7pc">
+            <w:hyperlink w:history="1" r:id="rIdvgsvm5xi3d1_vmtq1a2-w">
               <w:r>
                 <w:rPr>
                   <w:rFonts w:ascii="Arial" w:cs="Arial" w:eastAsia="Arial" w:hAnsi="Arial"/>
@@ -7874,7 +7874,7 @@
               <w:spacing w:after="10" w:before="0"/>
               <w:ind w:left="120"/>
             </w:pPr>
-            <w:hyperlink w:history="1" r:id="rIdnmmc-bhvcn6nj7cx8ywvt">
+            <w:hyperlink w:history="1" r:id="rIdebvkrons_cp5ovsmocsjs">
               <w:r>
                 <w:rPr>
                   <w:rFonts w:ascii="Arial" w:cs="Arial" w:eastAsia="Arial" w:hAnsi="Arial"/>
@@ -8177,7 +8177,7 @@
             <w:pPr>
               <w:spacing w:after="20" w:before="0"/>
             </w:pPr>
-            <w:hyperlink w:history="1" r:id="rIdrn7r6dg_2t-h5cs_eho0d">
+            <w:hyperlink w:history="1" r:id="rIdbss1e44xf_ict73tyjspx">
               <w:r>
                 <w:rPr>
                   <w:rFonts w:ascii="Arial" w:cs="Arial" w:eastAsia="Arial" w:hAnsi="Arial"/>
@@ -8210,7 +8210,7 @@
               <w:spacing w:after="10" w:before="0"/>
               <w:ind w:left="120"/>
             </w:pPr>
-            <w:hyperlink w:history="1" r:id="rId7sn1m_ougtwniqsmgf14n">
+            <w:hyperlink w:history="1" r:id="rIdx3vysbiahn4ehdqpezgrr">
               <w:r>
                 <w:rPr>
                   <w:rFonts w:ascii="Arial" w:cs="Arial" w:eastAsia="Arial" w:hAnsi="Arial"/>
@@ -8255,7 +8255,7 @@
             <w:pPr>
               <w:spacing w:after="20" w:before="0"/>
             </w:pPr>
-            <w:hyperlink w:history="1" r:id="rIdr7kjdaogkfgpnqvt616m1">
+            <w:hyperlink w:history="1" r:id="rIdwhvk-dtarhs9uenvzp4bm">
               <w:r>
                 <w:rPr>
                   <w:rFonts w:ascii="Arial" w:cs="Arial" w:eastAsia="Arial" w:hAnsi="Arial"/>
@@ -8288,7 +8288,7 @@
               <w:spacing w:after="10" w:before="0"/>
               <w:ind w:left="120"/>
             </w:pPr>
-            <w:hyperlink w:history="1" r:id="rIdtquavaionxvv4qwmmolv3">
+            <w:hyperlink w:history="1" r:id="rIdi1ecbconmznggwr8yuqgd">
               <w:r>
                 <w:rPr>
                   <w:rFonts w:ascii="Arial" w:cs="Arial" w:eastAsia="Arial" w:hAnsi="Arial"/>
@@ -8591,7 +8591,7 @@
             <w:pPr>
               <w:spacing w:after="20" w:before="0"/>
             </w:pPr>
-            <w:hyperlink w:history="1" r:id="rId4jmhos3srbakorr_9u7-q">
+            <w:hyperlink w:history="1" r:id="rIdzeqdizzkw7qckqmodd2pl">
               <w:r>
                 <w:rPr>
                   <w:rFonts w:ascii="Arial" w:cs="Arial" w:eastAsia="Arial" w:hAnsi="Arial"/>
@@ -8624,7 +8624,7 @@
               <w:spacing w:after="10" w:before="0"/>
               <w:ind w:left="120"/>
             </w:pPr>
-            <w:hyperlink w:history="1" r:id="rIdg1o_v5frwqptyrjxrq5b0">
+            <w:hyperlink w:history="1" r:id="rIdslryt3s1enlwnolhldq5j">
               <w:r>
                 <w:rPr>
                   <w:rFonts w:ascii="Arial" w:cs="Arial" w:eastAsia="Arial" w:hAnsi="Arial"/>
@@ -8669,7 +8669,7 @@
             <w:pPr>
               <w:spacing w:after="20" w:before="0"/>
             </w:pPr>
-            <w:hyperlink w:history="1" r:id="rIdwgtr3ekspqrrg9-9yfzoz">
+            <w:hyperlink w:history="1" r:id="rIdehusjqdy1h6su_zdaafl0">
               <w:r>
                 <w:rPr>
                   <w:rFonts w:ascii="Arial" w:cs="Arial" w:eastAsia="Arial" w:hAnsi="Arial"/>
@@ -8702,7 +8702,7 @@
               <w:spacing w:after="10" w:before="0"/>
               <w:ind w:left="120"/>
             </w:pPr>
-            <w:hyperlink w:history="1" r:id="rId446kwevmhwmz5oko6ixr8">
+            <w:hyperlink w:history="1" r:id="rIdg9pfzof-te1siuoe3tb2i">
               <w:r>
                 <w:rPr>
                   <w:rFonts w:ascii="Arial" w:cs="Arial" w:eastAsia="Arial" w:hAnsi="Arial"/>
@@ -8929,7 +8929,7 @@
             <w:pPr>
               <w:spacing w:after="20" w:before="0"/>
             </w:pPr>
-            <w:hyperlink w:history="1" r:id="rIdjvshkxhkj79pwxdarstbr">
+            <w:hyperlink w:history="1" r:id="rIdywqzortdr5ky9wqno1qda">
               <w:r>
                 <w:rPr>
                   <w:rFonts w:ascii="Arial" w:cs="Arial" w:eastAsia="Arial" w:hAnsi="Arial"/>
@@ -8962,7 +8962,7 @@
               <w:spacing w:after="10" w:before="0"/>
               <w:ind w:left="120"/>
             </w:pPr>
-            <w:hyperlink w:history="1" r:id="rIdskxboxtnz-svpzih7ht22">
+            <w:hyperlink w:history="1" r:id="rId0jref3xxcnhrkcknpd1j9">
               <w:r>
                 <w:rPr>
                   <w:rFonts w:ascii="Arial" w:cs="Arial" w:eastAsia="Arial" w:hAnsi="Arial"/>
@@ -9007,7 +9007,7 @@
             <w:pPr>
               <w:spacing w:after="20" w:before="0"/>
             </w:pPr>
-            <w:hyperlink w:history="1" r:id="rIdjwslng9y-jk3ff186lua0">
+            <w:hyperlink w:history="1" r:id="rId95ksdii1jzoewbjtje05t">
               <w:r>
                 <w:rPr>
                   <w:rFonts w:ascii="Arial" w:cs="Arial" w:eastAsia="Arial" w:hAnsi="Arial"/>
@@ -9040,7 +9040,7 @@
               <w:spacing w:after="10" w:before="0"/>
               <w:ind w:left="120"/>
             </w:pPr>
-            <w:hyperlink w:history="1" r:id="rIde2lbn7xtlu4dherb8qguq">
+            <w:hyperlink w:history="1" r:id="rIdqto-mjmwjdj48vhu5xdp3">
               <w:r>
                 <w:rPr>
                   <w:rFonts w:ascii="Arial" w:cs="Arial" w:eastAsia="Arial" w:hAnsi="Arial"/>
@@ -11050,7 +11050,7 @@
             <w:pPr>
               <w:spacing w:after="20" w:before="0"/>
             </w:pPr>
-            <w:hyperlink w:history="1" r:id="rIdooiuc9g6ixmazzvtd3ler">
+            <w:hyperlink w:history="1" r:id="rIdkqqdaeyzhez6k0v88ykga">
               <w:r>
                 <w:rPr>
                   <w:rFonts w:ascii="Arial" w:cs="Arial" w:eastAsia="Arial" w:hAnsi="Arial"/>
@@ -11083,7 +11083,7 @@
               <w:spacing w:after="10" w:before="0"/>
               <w:ind w:left="120"/>
             </w:pPr>
-            <w:hyperlink w:history="1" r:id="rIddaj94ohzb7dqfxxcagay-">
+            <w:hyperlink w:history="1" r:id="rId9fswpblviheqxx2m7t_ym">
               <w:r>
                 <w:rPr>
                   <w:rFonts w:ascii="Arial" w:cs="Arial" w:eastAsia="Arial" w:hAnsi="Arial"/>
@@ -11128,7 +11128,7 @@
             <w:pPr>
               <w:spacing w:after="20" w:before="0"/>
             </w:pPr>
-            <w:hyperlink w:history="1" r:id="rIdeq2shtroxco54379mibmm">
+            <w:hyperlink w:history="1" r:id="rIdqrcxzivpfphafdlge5fwe">
               <w:r>
                 <w:rPr>
                   <w:rFonts w:ascii="Arial" w:cs="Arial" w:eastAsia="Arial" w:hAnsi="Arial"/>
@@ -11161,7 +11161,7 @@
               <w:spacing w:after="10" w:before="0"/>
               <w:ind w:left="120"/>
             </w:pPr>
-            <w:hyperlink w:history="1" r:id="rIdlb0wzpuow90oqw1jbi8l9">
+            <w:hyperlink w:history="1" r:id="rIdabcw-oxz2v7suipwwo4mp">
               <w:r>
                 <w:rPr>
                   <w:rFonts w:ascii="Arial" w:cs="Arial" w:eastAsia="Arial" w:hAnsi="Arial"/>
@@ -11502,7 +11502,7 @@
             <w:pPr>
               <w:spacing w:after="20" w:before="0"/>
             </w:pPr>
-            <w:hyperlink w:history="1" r:id="rIdrtu2wu0cly1gufdj7uycb">
+            <w:hyperlink w:history="1" r:id="rIdaayhxcijqgccvx95sexg-">
               <w:r>
                 <w:rPr>
                   <w:rFonts w:ascii="Arial" w:cs="Arial" w:eastAsia="Arial" w:hAnsi="Arial"/>
@@ -11535,7 +11535,7 @@
               <w:spacing w:after="10" w:before="0"/>
               <w:ind w:left="120"/>
             </w:pPr>
-            <w:hyperlink w:history="1" r:id="rIdswyxyikxhpzgix_hlx7yg">
+            <w:hyperlink w:history="1" r:id="rIdbso3_ozb117vpbcyyefaq">
               <w:r>
                 <w:rPr>
                   <w:rFonts w:ascii="Arial" w:cs="Arial" w:eastAsia="Arial" w:hAnsi="Arial"/>
@@ -11580,7 +11580,7 @@
             <w:pPr>
               <w:spacing w:after="20" w:before="0"/>
             </w:pPr>
-            <w:hyperlink w:history="1" r:id="rIdm0he8rq3n17ruahfc7lid">
+            <w:hyperlink w:history="1" r:id="rIdh5qfylwrjxrsx-du3hgyf">
               <w:r>
                 <w:rPr>
                   <w:rFonts w:ascii="Arial" w:cs="Arial" w:eastAsia="Arial" w:hAnsi="Arial"/>
@@ -11613,7 +11613,7 @@
               <w:spacing w:after="10" w:before="0"/>
               <w:ind w:left="120"/>
             </w:pPr>
-            <w:hyperlink w:history="1" r:id="rId8n3xr1ia4anirn_qzueqo">
+            <w:hyperlink w:history="1" r:id="rIdq4xqysuomi6_lnzpuyt4x">
               <w:r>
                 <w:rPr>
                   <w:rFonts w:ascii="Arial" w:cs="Arial" w:eastAsia="Arial" w:hAnsi="Arial"/>
@@ -11897,7 +11897,7 @@
             <w:pPr>
               <w:spacing w:after="20" w:before="0"/>
             </w:pPr>
-            <w:hyperlink w:history="1" r:id="rIdxdrr-4thyvoklv3ydaark">
+            <w:hyperlink w:history="1" r:id="rIdmsrw4fqlefyxplcfputjj">
               <w:r>
                 <w:rPr>
                   <w:rFonts w:ascii="Arial" w:cs="Arial" w:eastAsia="Arial" w:hAnsi="Arial"/>
@@ -11930,7 +11930,7 @@
               <w:spacing w:after="10" w:before="0"/>
               <w:ind w:left="120"/>
             </w:pPr>
-            <w:hyperlink w:history="1" r:id="rIdufn623dfbfwdecnew7orl">
+            <w:hyperlink w:history="1" r:id="rId7-f8cvlvej8kh92t4jjb7">
               <w:r>
                 <w:rPr>
                   <w:rFonts w:ascii="Arial" w:cs="Arial" w:eastAsia="Arial" w:hAnsi="Arial"/>
@@ -11975,7 +11975,7 @@
             <w:pPr>
               <w:spacing w:after="20" w:before="0"/>
             </w:pPr>
-            <w:hyperlink w:history="1" r:id="rIdf4ux2th1cdwrnrglcf6mt">
+            <w:hyperlink w:history="1" r:id="rIdlp89yl6xyg4dicuplahi4">
               <w:r>
                 <w:rPr>
                   <w:rFonts w:ascii="Arial" w:cs="Arial" w:eastAsia="Arial" w:hAnsi="Arial"/>
@@ -12008,7 +12008,7 @@
               <w:spacing w:after="10" w:before="0"/>
               <w:ind w:left="120"/>
             </w:pPr>
-            <w:hyperlink w:history="1" r:id="rIdcoqsj1hgdajm6qonhjope">
+            <w:hyperlink w:history="1" r:id="rIdquek9pg1tomguftyfv6y-">
               <w:r>
                 <w:rPr>
                   <w:rFonts w:ascii="Arial" w:cs="Arial" w:eastAsia="Arial" w:hAnsi="Arial"/>
@@ -12292,7 +12292,7 @@
             <w:pPr>
               <w:spacing w:after="20" w:before="0"/>
             </w:pPr>
-            <w:hyperlink w:history="1" r:id="rIdpini0_b9iuct-t-jlnend">
+            <w:hyperlink w:history="1" r:id="rIdj6ntybqspx1-r8qe-ml7n">
               <w:r>
                 <w:rPr>
                   <w:rFonts w:ascii="Arial" w:cs="Arial" w:eastAsia="Arial" w:hAnsi="Arial"/>
@@ -12325,7 +12325,7 @@
               <w:spacing w:after="10" w:before="0"/>
               <w:ind w:left="120"/>
             </w:pPr>
-            <w:hyperlink w:history="1" r:id="rIdodbi5qcbw_scq4vq4xigm">
+            <w:hyperlink w:history="1" r:id="rIddf2tybbrkdf_h1ncask6k">
               <w:r>
                 <w:rPr>
                   <w:rFonts w:ascii="Arial" w:cs="Arial" w:eastAsia="Arial" w:hAnsi="Arial"/>
@@ -12370,7 +12370,7 @@
             <w:pPr>
               <w:spacing w:after="20" w:before="0"/>
             </w:pPr>
-            <w:hyperlink w:history="1" r:id="rIdzugpvm3xrhuao34axxuls">
+            <w:hyperlink w:history="1" r:id="rIdhj1vf_n3jnmqpy_vujpy5">
               <w:r>
                 <w:rPr>
                   <w:rFonts w:ascii="Arial" w:cs="Arial" w:eastAsia="Arial" w:hAnsi="Arial"/>
@@ -12403,7 +12403,7 @@
               <w:spacing w:after="10" w:before="0"/>
               <w:ind w:left="120"/>
             </w:pPr>
-            <w:hyperlink w:history="1" r:id="rIdnuhb8k_nwffujh3pkqqth">
+            <w:hyperlink w:history="1" r:id="rIdplgv5opkoebcih65tfbkx">
               <w:r>
                 <w:rPr>
                   <w:rFonts w:ascii="Arial" w:cs="Arial" w:eastAsia="Arial" w:hAnsi="Arial"/>
@@ -12630,7 +12630,7 @@
             <w:pPr>
               <w:spacing w:after="20" w:before="0"/>
             </w:pPr>
-            <w:hyperlink w:history="1" r:id="rId7jaueaep_hkiez1qwatos">
+            <w:hyperlink w:history="1" r:id="rIdsgysd8wt-y-w6xjrdmmlr">
               <w:r>
                 <w:rPr>
                   <w:rFonts w:ascii="Arial" w:cs="Arial" w:eastAsia="Arial" w:hAnsi="Arial"/>
@@ -12663,7 +12663,7 @@
               <w:spacing w:after="10" w:before="0"/>
               <w:ind w:left="120"/>
             </w:pPr>
-            <w:hyperlink w:history="1" r:id="rIdynmbhc0gs8lrlgwr0tf8b">
+            <w:hyperlink w:history="1" r:id="rIdhxvncj2amgznuayfpqpd-">
               <w:r>
                 <w:rPr>
                   <w:rFonts w:ascii="Arial" w:cs="Arial" w:eastAsia="Arial" w:hAnsi="Arial"/>
@@ -12708,7 +12708,7 @@
             <w:pPr>
               <w:spacing w:after="20" w:before="0"/>
             </w:pPr>
-            <w:hyperlink w:history="1" r:id="rIdsfyyfj8u21u-vdkubhnho">
+            <w:hyperlink w:history="1" r:id="rIdp4h8t70nyesjl69mnw2au">
               <w:r>
                 <w:rPr>
                   <w:rFonts w:ascii="Arial" w:cs="Arial" w:eastAsia="Arial" w:hAnsi="Arial"/>
@@ -12741,7 +12741,7 @@
               <w:spacing w:after="10" w:before="0"/>
               <w:ind w:left="120"/>
             </w:pPr>
-            <w:hyperlink w:history="1" r:id="rIdwdl85uxcxcjxsdqa2bpey">
+            <w:hyperlink w:history="1" r:id="rId5lvsndvqgjrso7dajfqf2">
               <w:r>
                 <w:rPr>
                   <w:rFonts w:ascii="Arial" w:cs="Arial" w:eastAsia="Arial" w:hAnsi="Arial"/>
@@ -14731,7 +14731,7 @@
             <w:pPr>
               <w:spacing w:after="20" w:before="0"/>
             </w:pPr>
-            <w:hyperlink w:history="1" r:id="rIdw_7ntss2iobpxfkvwoddj">
+            <w:hyperlink w:history="1" r:id="rIdhlfkfma0u1ko9asp_udst">
               <w:r>
                 <w:rPr>
                   <w:rFonts w:ascii="Arial" w:cs="Arial" w:eastAsia="Arial" w:hAnsi="Arial"/>
@@ -14764,7 +14764,7 @@
               <w:spacing w:after="10" w:before="0"/>
               <w:ind w:left="120"/>
             </w:pPr>
-            <w:hyperlink w:history="1" r:id="rId3wrkloxt-t9cbop-pum0t">
+            <w:hyperlink w:history="1" r:id="rIdodtwbq1-igj-gdrxitrbq">
               <w:r>
                 <w:rPr>
                   <w:rFonts w:ascii="Arial" w:cs="Arial" w:eastAsia="Arial" w:hAnsi="Arial"/>
@@ -14809,7 +14809,7 @@
             <w:pPr>
               <w:spacing w:after="20" w:before="0"/>
             </w:pPr>
-            <w:hyperlink w:history="1" r:id="rIdxskjqxtxupptshtss3hbf">
+            <w:hyperlink w:history="1" r:id="rId-p5viz-djnxmgikfmjy0i">
               <w:r>
                 <w:rPr>
                   <w:rFonts w:ascii="Arial" w:cs="Arial" w:eastAsia="Arial" w:hAnsi="Arial"/>
@@ -14842,7 +14842,7 @@
               <w:spacing w:after="10" w:before="0"/>
               <w:ind w:left="120"/>
             </w:pPr>
-            <w:hyperlink w:history="1" r:id="rIdnelupcfdfue8gfdrovfiy">
+            <w:hyperlink w:history="1" r:id="rIdvs2yxymros3sof7_qu-v1">
               <w:r>
                 <w:rPr>
                   <w:rFonts w:ascii="Arial" w:cs="Arial" w:eastAsia="Arial" w:hAnsi="Arial"/>
@@ -15221,7 +15221,7 @@
             <w:pPr>
               <w:spacing w:after="20" w:before="0"/>
             </w:pPr>
-            <w:hyperlink w:history="1" r:id="rIdsyltu8j8tf1app5gi3nqu">
+            <w:hyperlink w:history="1" r:id="rId99hkaly9al91xkw8ctzks">
               <w:r>
                 <w:rPr>
                   <w:rFonts w:ascii="Arial" w:cs="Arial" w:eastAsia="Arial" w:hAnsi="Arial"/>
@@ -15254,7 +15254,7 @@
               <w:spacing w:after="10" w:before="0"/>
               <w:ind w:left="120"/>
             </w:pPr>
-            <w:hyperlink w:history="1" r:id="rIdv7ypxjguhpbkw0xwbwihk">
+            <w:hyperlink w:history="1" r:id="rIdijprcx472eqrqx7ahrzvs">
               <w:r>
                 <w:rPr>
                   <w:rFonts w:ascii="Arial" w:cs="Arial" w:eastAsia="Arial" w:hAnsi="Arial"/>
@@ -15299,7 +15299,7 @@
             <w:pPr>
               <w:spacing w:after="20" w:before="0"/>
             </w:pPr>
-            <w:hyperlink w:history="1" r:id="rIdaoigmuzv0guvgkvhrrbqj">
+            <w:hyperlink w:history="1" r:id="rIdhzsly1tpzehjuo0tkgrmr">
               <w:r>
                 <w:rPr>
                   <w:rFonts w:ascii="Arial" w:cs="Arial" w:eastAsia="Arial" w:hAnsi="Arial"/>
@@ -15332,7 +15332,7 @@
               <w:spacing w:after="10" w:before="0"/>
               <w:ind w:left="120"/>
             </w:pPr>
-            <w:hyperlink w:history="1" r:id="rId4l3oo4dmbz-ohndlz6erj">
+            <w:hyperlink w:history="1" r:id="rIdg9yqhvjlp_q2odmadhl3s">
               <w:r>
                 <w:rPr>
                   <w:rFonts w:ascii="Arial" w:cs="Arial" w:eastAsia="Arial" w:hAnsi="Arial"/>
@@ -15692,7 +15692,7 @@
             <w:pPr>
               <w:spacing w:after="20" w:before="0"/>
             </w:pPr>
-            <w:hyperlink w:history="1" r:id="rIdyf7h8-hdrdeyvd_x_5jbt">
+            <w:hyperlink w:history="1" r:id="rIdbr93xyx-booyhd_fkketu">
               <w:r>
                 <w:rPr>
                   <w:rFonts w:ascii="Arial" w:cs="Arial" w:eastAsia="Arial" w:hAnsi="Arial"/>
@@ -15725,7 +15725,7 @@
               <w:spacing w:after="10" w:before="0"/>
               <w:ind w:left="120"/>
             </w:pPr>
-            <w:hyperlink w:history="1" r:id="rIduoaq1gwuh1rto9ykpmaop">
+            <w:hyperlink w:history="1" r:id="rIdydxckrjtjz92pcvhn06uu">
               <w:r>
                 <w:rPr>
                   <w:rFonts w:ascii="Arial" w:cs="Arial" w:eastAsia="Arial" w:hAnsi="Arial"/>
@@ -15770,7 +15770,7 @@
             <w:pPr>
               <w:spacing w:after="20" w:before="0"/>
             </w:pPr>
-            <w:hyperlink w:history="1" r:id="rIdg7odyegmb_du0iwjpggtz">
+            <w:hyperlink w:history="1" r:id="rIdele39yi8ht_rzfaf7qfrf">
               <w:r>
                 <w:rPr>
                   <w:rFonts w:ascii="Arial" w:cs="Arial" w:eastAsia="Arial" w:hAnsi="Arial"/>
@@ -15803,7 +15803,7 @@
               <w:spacing w:after="10" w:before="0"/>
               <w:ind w:left="120"/>
             </w:pPr>
-            <w:hyperlink w:history="1" r:id="rIdu-i3cdpofbkagwrvprjt2">
+            <w:hyperlink w:history="1" r:id="rIduo7tujhstj8qtpuqo_fop">
               <w:r>
                 <w:rPr>
                   <w:rFonts w:ascii="Arial" w:cs="Arial" w:eastAsia="Arial" w:hAnsi="Arial"/>
@@ -16125,7 +16125,7 @@
             <w:pPr>
               <w:spacing w:after="20" w:before="0"/>
             </w:pPr>
-            <w:hyperlink w:history="1" r:id="rId_9ac9xanffyvwuny62ecc">
+            <w:hyperlink w:history="1" r:id="rIdf0nyz3tcckmi_slueqofc">
               <w:r>
                 <w:rPr>
                   <w:rFonts w:ascii="Arial" w:cs="Arial" w:eastAsia="Arial" w:hAnsi="Arial"/>
@@ -16158,7 +16158,7 @@
               <w:spacing w:after="10" w:before="0"/>
               <w:ind w:left="120"/>
             </w:pPr>
-            <w:hyperlink w:history="1" r:id="rIddzuxa6iwd2da4pv9b7ni4">
+            <w:hyperlink w:history="1" r:id="rId_m6j4rquek9n26xwczimp">
               <w:r>
                 <w:rPr>
                   <w:rFonts w:ascii="Arial" w:cs="Arial" w:eastAsia="Arial" w:hAnsi="Arial"/>
@@ -16203,7 +16203,7 @@
             <w:pPr>
               <w:spacing w:after="20" w:before="0"/>
             </w:pPr>
-            <w:hyperlink w:history="1" r:id="rId6uur9hypocgkdqwsuvnsw">
+            <w:hyperlink w:history="1" r:id="rIdduhha4ib2v-seo6v_nman">
               <w:r>
                 <w:rPr>
                   <w:rFonts w:ascii="Arial" w:cs="Arial" w:eastAsia="Arial" w:hAnsi="Arial"/>
@@ -16236,7 +16236,7 @@
               <w:spacing w:after="10" w:before="0"/>
               <w:ind w:left="120"/>
             </w:pPr>
-            <w:hyperlink w:history="1" r:id="rIddlo7knaecgasunawckxis">
+            <w:hyperlink w:history="1" r:id="rIdijt25yclkyhdiwpvzcit_">
               <w:r>
                 <w:rPr>
                   <w:rFonts w:ascii="Arial" w:cs="Arial" w:eastAsia="Arial" w:hAnsi="Arial"/>
@@ -16463,7 +16463,7 @@
             <w:pPr>
               <w:spacing w:after="20" w:before="0"/>
             </w:pPr>
-            <w:hyperlink w:history="1" r:id="rIdi3-c0g3fzygnthfjtu_0y">
+            <w:hyperlink w:history="1" r:id="rIdiegc0lwqmqcx-4lrizgrk">
               <w:r>
                 <w:rPr>
                   <w:rFonts w:ascii="Arial" w:cs="Arial" w:eastAsia="Arial" w:hAnsi="Arial"/>
@@ -16496,7 +16496,7 @@
               <w:spacing w:after="10" w:before="0"/>
               <w:ind w:left="120"/>
             </w:pPr>
-            <w:hyperlink w:history="1" r:id="rIdlvsarckg9vtxmspkns_28">
+            <w:hyperlink w:history="1" r:id="rIderxurbw8ebx_7qtga5www">
               <w:r>
                 <w:rPr>
                   <w:rFonts w:ascii="Arial" w:cs="Arial" w:eastAsia="Arial" w:hAnsi="Arial"/>
@@ -16541,7 +16541,7 @@
             <w:pPr>
               <w:spacing w:after="20" w:before="0"/>
             </w:pPr>
-            <w:hyperlink w:history="1" r:id="rIdxhsmx-entrhswzspmb8zz">
+            <w:hyperlink w:history="1" r:id="rIdxir41nwcyyl1dgnroe77a">
               <w:r>
                 <w:rPr>
                   <w:rFonts w:ascii="Arial" w:cs="Arial" w:eastAsia="Arial" w:hAnsi="Arial"/>
@@ -16574,7 +16574,7 @@
               <w:spacing w:after="10" w:before="0"/>
               <w:ind w:left="120"/>
             </w:pPr>
-            <w:hyperlink w:history="1" r:id="rIdoazixbylg4upswzpnwfjd">
+            <w:hyperlink w:history="1" r:id="rIdl71u2ajmj5qcqxjern6rw">
               <w:r>
                 <w:rPr>
                   <w:rFonts w:ascii="Arial" w:cs="Arial" w:eastAsia="Arial" w:hAnsi="Arial"/>
@@ -18565,7 +18565,7 @@
             <w:pPr>
               <w:spacing w:after="20" w:before="0"/>
             </w:pPr>
-            <w:hyperlink w:history="1" r:id="rIdcwxewxjs8fsue1bbbfiqw">
+            <w:hyperlink w:history="1" r:id="rIdth3gnbzgt3ovrayvailfp">
               <w:r>
                 <w:rPr>
                   <w:rFonts w:ascii="Arial" w:cs="Arial" w:eastAsia="Arial" w:hAnsi="Arial"/>
@@ -18598,7 +18598,7 @@
               <w:spacing w:after="10" w:before="0"/>
               <w:ind w:left="120"/>
             </w:pPr>
-            <w:hyperlink w:history="1" r:id="rIdhkrqq7yw7-wqcggau42c5">
+            <w:hyperlink w:history="1" r:id="rId5dds8xyr91q4iekaah5b5">
               <w:r>
                 <w:rPr>
                   <w:rFonts w:ascii="Arial" w:cs="Arial" w:eastAsia="Arial" w:hAnsi="Arial"/>
@@ -18643,7 +18643,7 @@
             <w:pPr>
               <w:spacing w:after="20" w:before="0"/>
             </w:pPr>
-            <w:hyperlink w:history="1" r:id="rIdrxeqpsmrcqbwyzitmoood">
+            <w:hyperlink w:history="1" r:id="rIdipps53dage1u1ivtfh9en">
               <w:r>
                 <w:rPr>
                   <w:rFonts w:ascii="Arial" w:cs="Arial" w:eastAsia="Arial" w:hAnsi="Arial"/>
@@ -18676,7 +18676,7 @@
               <w:spacing w:after="10" w:before="0"/>
               <w:ind w:left="120"/>
             </w:pPr>
-            <w:hyperlink w:history="1" r:id="rIdodsx2rmql1qqklbcxwmsy">
+            <w:hyperlink w:history="1" r:id="rId_v3b1jtpuodaaadssiomv">
               <w:r>
                 <w:rPr>
                   <w:rFonts w:ascii="Arial" w:cs="Arial" w:eastAsia="Arial" w:hAnsi="Arial"/>
@@ -18998,7 +18998,7 @@
             <w:pPr>
               <w:spacing w:after="20" w:before="0"/>
             </w:pPr>
-            <w:hyperlink w:history="1" r:id="rIdxti7ylr7sp8p8dr-ej9z9">
+            <w:hyperlink w:history="1" r:id="rId186c1_6reqw121vfxpfpv">
               <w:r>
                 <w:rPr>
                   <w:rFonts w:ascii="Arial" w:cs="Arial" w:eastAsia="Arial" w:hAnsi="Arial"/>
@@ -19031,7 +19031,7 @@
               <w:spacing w:after="10" w:before="0"/>
               <w:ind w:left="120"/>
             </w:pPr>
-            <w:hyperlink w:history="1" r:id="rIdh20dgsrwqcgj3unmrt3lf">
+            <w:hyperlink w:history="1" r:id="rIdr9hvhavwybi5bdo_n_ned">
               <w:r>
                 <w:rPr>
                   <w:rFonts w:ascii="Arial" w:cs="Arial" w:eastAsia="Arial" w:hAnsi="Arial"/>
@@ -19076,7 +19076,7 @@
             <w:pPr>
               <w:spacing w:after="20" w:before="0"/>
             </w:pPr>
-            <w:hyperlink w:history="1" r:id="rId4y0tv-tswtiymtu-l2nzk">
+            <w:hyperlink w:history="1" r:id="rIdxbk-iegd4banyxncgh4pc">
               <w:r>
                 <w:rPr>
                   <w:rFonts w:ascii="Arial" w:cs="Arial" w:eastAsia="Arial" w:hAnsi="Arial"/>
@@ -19109,7 +19109,7 @@
               <w:spacing w:after="10" w:before="0"/>
               <w:ind w:left="120"/>
             </w:pPr>
-            <w:hyperlink w:history="1" r:id="rIdxtsgn4bnlwimqk9yv4acb">
+            <w:hyperlink w:history="1" r:id="rIdnfmuaubnlqg9io3iblmei">
               <w:r>
                 <w:rPr>
                   <w:rFonts w:ascii="Arial" w:cs="Arial" w:eastAsia="Arial" w:hAnsi="Arial"/>
@@ -19412,7 +19412,7 @@
             <w:pPr>
               <w:spacing w:after="20" w:before="0"/>
             </w:pPr>
-            <w:hyperlink w:history="1" r:id="rId3yakcmjkrzjo2uzilsm61">
+            <w:hyperlink w:history="1" r:id="rIdskbcwf26rbp3fitnxhgjs">
               <w:r>
                 <w:rPr>
                   <w:rFonts w:ascii="Arial" w:cs="Arial" w:eastAsia="Arial" w:hAnsi="Arial"/>
@@ -19445,7 +19445,7 @@
               <w:spacing w:after="10" w:before="0"/>
               <w:ind w:left="120"/>
             </w:pPr>
-            <w:hyperlink w:history="1" r:id="rIdrn3uc2oeyw__gixcog-jm">
+            <w:hyperlink w:history="1" r:id="rId50a3hzolvvjyhjyvk2iam">
               <w:r>
                 <w:rPr>
                   <w:rFonts w:ascii="Arial" w:cs="Arial" w:eastAsia="Arial" w:hAnsi="Arial"/>
@@ -19490,7 +19490,7 @@
             <w:pPr>
               <w:spacing w:after="20" w:before="0"/>
             </w:pPr>
-            <w:hyperlink w:history="1" r:id="rIdu1jornu1scfrzy5nmulkt">
+            <w:hyperlink w:history="1" r:id="rIda8mzrgiqbvzsd3vhi9cm6">
               <w:r>
                 <w:rPr>
                   <w:rFonts w:ascii="Arial" w:cs="Arial" w:eastAsia="Arial" w:hAnsi="Arial"/>
@@ -19523,7 +19523,7 @@
               <w:spacing w:after="10" w:before="0"/>
               <w:ind w:left="120"/>
             </w:pPr>
-            <w:hyperlink w:history="1" r:id="rId274xij3luc8uxsgb6ekdk">
+            <w:hyperlink w:history="1" r:id="rIdnkecoyxv_evvodeil5csc">
               <w:r>
                 <w:rPr>
                   <w:rFonts w:ascii="Arial" w:cs="Arial" w:eastAsia="Arial" w:hAnsi="Arial"/>
@@ -19807,7 +19807,7 @@
             <w:pPr>
               <w:spacing w:after="20" w:before="0"/>
             </w:pPr>
-            <w:hyperlink w:history="1" r:id="rIdbhfuayokducvievxkxwpi">
+            <w:hyperlink w:history="1" r:id="rIdg-2onmlhu8921beiu326m">
               <w:r>
                 <w:rPr>
                   <w:rFonts w:ascii="Arial" w:cs="Arial" w:eastAsia="Arial" w:hAnsi="Arial"/>
@@ -19840,7 +19840,7 @@
               <w:spacing w:after="10" w:before="0"/>
               <w:ind w:left="120"/>
             </w:pPr>
-            <w:hyperlink w:history="1" r:id="rIdg2zk3f-v1ssccf9rwmfz5">
+            <w:hyperlink w:history="1" r:id="rId0ttu2my4x7g9aalqmnmqf">
               <w:r>
                 <w:rPr>
                   <w:rFonts w:ascii="Arial" w:cs="Arial" w:eastAsia="Arial" w:hAnsi="Arial"/>
@@ -19885,7 +19885,7 @@
             <w:pPr>
               <w:spacing w:after="20" w:before="0"/>
             </w:pPr>
-            <w:hyperlink w:history="1" r:id="rId6d3ef5pls5fvdk40ybtes">
+            <w:hyperlink w:history="1" r:id="rId204rrqfbqlzh_30bt7e9w">
               <w:r>
                 <w:rPr>
                   <w:rFonts w:ascii="Arial" w:cs="Arial" w:eastAsia="Arial" w:hAnsi="Arial"/>
@@ -19918,7 +19918,7 @@
               <w:spacing w:after="10" w:before="0"/>
               <w:ind w:left="120"/>
             </w:pPr>
-            <w:hyperlink w:history="1" r:id="rIdctxf_t17d3kyviwr9p5df">
+            <w:hyperlink w:history="1" r:id="rIddcz0h8wwljtpokkq0kddb">
               <w:r>
                 <w:rPr>
                   <w:rFonts w:ascii="Arial" w:cs="Arial" w:eastAsia="Arial" w:hAnsi="Arial"/>
@@ -20145,7 +20145,7 @@
             <w:pPr>
               <w:spacing w:after="20" w:before="0"/>
             </w:pPr>
-            <w:hyperlink w:history="1" r:id="rIdli-1lefr2nv_io441rnp7">
+            <w:hyperlink w:history="1" r:id="rIdfshpl1a8f34_d0b7pdgv4">
               <w:r>
                 <w:rPr>
                   <w:rFonts w:ascii="Arial" w:cs="Arial" w:eastAsia="Arial" w:hAnsi="Arial"/>
@@ -20178,7 +20178,7 @@
               <w:spacing w:after="10" w:before="0"/>
               <w:ind w:left="120"/>
             </w:pPr>
-            <w:hyperlink w:history="1" r:id="rIdf4t-wqgfdgve0dqjacgvm">
+            <w:hyperlink w:history="1" r:id="rIdkqvptxafbev8boi9vwxmo">
               <w:r>
                 <w:rPr>
                   <w:rFonts w:ascii="Arial" w:cs="Arial" w:eastAsia="Arial" w:hAnsi="Arial"/>
@@ -20223,7 +20223,7 @@
             <w:pPr>
               <w:spacing w:after="20" w:before="0"/>
             </w:pPr>
-            <w:hyperlink w:history="1" r:id="rId5ej2i1qbyrwsbt0naarus">
+            <w:hyperlink w:history="1" r:id="rId1o5recdeepzmbejutl9vg">
               <w:r>
                 <w:rPr>
                   <w:rFonts w:ascii="Arial" w:cs="Arial" w:eastAsia="Arial" w:hAnsi="Arial"/>
@@ -20256,7 +20256,7 @@
               <w:spacing w:after="10" w:before="0"/>
               <w:ind w:left="120"/>
             </w:pPr>
-            <w:hyperlink w:history="1" r:id="rIdhyeej0oufttug1gusrc7y">
+            <w:hyperlink w:history="1" r:id="rIdddpmdsa8c16jfjxhfdflw">
               <w:r>
                 <w:rPr>
                   <w:rFonts w:ascii="Arial" w:cs="Arial" w:eastAsia="Arial" w:hAnsi="Arial"/>
@@ -22266,7 +22266,7 @@
             <w:pPr>
               <w:spacing w:after="20" w:before="0"/>
             </w:pPr>
-            <w:hyperlink w:history="1" r:id="rIdgicremumdoul-sjdjvj4q">
+            <w:hyperlink w:history="1" r:id="rIdkikmn2rkorzszfztbwo2w">
               <w:r>
                 <w:rPr>
                   <w:rFonts w:ascii="Arial" w:cs="Arial" w:eastAsia="Arial" w:hAnsi="Arial"/>
@@ -22299,7 +22299,7 @@
               <w:spacing w:after="10" w:before="0"/>
               <w:ind w:left="120"/>
             </w:pPr>
-            <w:hyperlink w:history="1" r:id="rIdmgyatjw5nrvzniwikd-dw">
+            <w:hyperlink w:history="1" r:id="rIdebnqbl-uztnsw0bcraxtc">
               <w:r>
                 <w:rPr>
                   <w:rFonts w:ascii="Arial" w:cs="Arial" w:eastAsia="Arial" w:hAnsi="Arial"/>
@@ -22344,7 +22344,7 @@
             <w:pPr>
               <w:spacing w:after="20" w:before="0"/>
             </w:pPr>
-            <w:hyperlink w:history="1" r:id="rId22zu7acojc1kr_lnhiz2i">
+            <w:hyperlink w:history="1" r:id="rIdu16a4lbqa6j328c3vuszo">
               <w:r>
                 <w:rPr>
                   <w:rFonts w:ascii="Arial" w:cs="Arial" w:eastAsia="Arial" w:hAnsi="Arial"/>
@@ -22377,7 +22377,7 @@
               <w:spacing w:after="10" w:before="0"/>
               <w:ind w:left="120"/>
             </w:pPr>
-            <w:hyperlink w:history="1" r:id="rIdol3kwoy5jjr3muqcofhuy">
+            <w:hyperlink w:history="1" r:id="rIdmfh2cljjuu1fnpw4abfqg">
               <w:r>
                 <w:rPr>
                   <w:rFonts w:ascii="Arial" w:cs="Arial" w:eastAsia="Arial" w:hAnsi="Arial"/>
@@ -22779,7 +22779,7 @@
             <w:pPr>
               <w:spacing w:after="20" w:before="0"/>
             </w:pPr>
-            <w:hyperlink w:history="1" r:id="rIdhzmejesu8ihzp1dw3gcjk">
+            <w:hyperlink w:history="1" r:id="rIdkedm_2fqbqleff8pflddg">
               <w:r>
                 <w:rPr>
                   <w:rFonts w:ascii="Arial" w:cs="Arial" w:eastAsia="Arial" w:hAnsi="Arial"/>
@@ -22812,7 +22812,7 @@
               <w:spacing w:after="10" w:before="0"/>
               <w:ind w:left="120"/>
             </w:pPr>
-            <w:hyperlink w:history="1" r:id="rIdpj2xo__cx25z5qthlhdr0">
+            <w:hyperlink w:history="1" r:id="rIdcxx9wfn8iciqfda3uwmlh">
               <w:r>
                 <w:rPr>
                   <w:rFonts w:ascii="Arial" w:cs="Arial" w:eastAsia="Arial" w:hAnsi="Arial"/>
@@ -22857,7 +22857,7 @@
             <w:pPr>
               <w:spacing w:after="20" w:before="0"/>
             </w:pPr>
-            <w:hyperlink w:history="1" r:id="rIdamspezxivsyrdxthftlsq">
+            <w:hyperlink w:history="1" r:id="rIddwblvzpin6yz_ni3agzeo">
               <w:r>
                 <w:rPr>
                   <w:rFonts w:ascii="Arial" w:cs="Arial" w:eastAsia="Arial" w:hAnsi="Arial"/>
@@ -22890,7 +22890,7 @@
               <w:spacing w:after="10" w:before="0"/>
               <w:ind w:left="120"/>
             </w:pPr>
-            <w:hyperlink w:history="1" r:id="rIdwbpgpsh0bvgy3hauzys4y">
+            <w:hyperlink w:history="1" r:id="rIdmxo-vywrlst335ei7ljfe">
               <w:r>
                 <w:rPr>
                   <w:rFonts w:ascii="Arial" w:cs="Arial" w:eastAsia="Arial" w:hAnsi="Arial"/>
@@ -23250,7 +23250,7 @@
             <w:pPr>
               <w:spacing w:after="20" w:before="0"/>
             </w:pPr>
-            <w:hyperlink w:history="1" r:id="rIdolrgu7ode3130yby4ka7h">
+            <w:hyperlink w:history="1" r:id="rIdwwq34lbkeenhgkzim4o31">
               <w:r>
                 <w:rPr>
                   <w:rFonts w:ascii="Arial" w:cs="Arial" w:eastAsia="Arial" w:hAnsi="Arial"/>
@@ -23283,7 +23283,7 @@
               <w:spacing w:after="10" w:before="0"/>
               <w:ind w:left="120"/>
             </w:pPr>
-            <w:hyperlink w:history="1" r:id="rIdu4grbimqgc4ih28nyk7u8">
+            <w:hyperlink w:history="1" r:id="rId6a6u1bhzmcpc6q13xzuod">
               <w:r>
                 <w:rPr>
                   <w:rFonts w:ascii="Arial" w:cs="Arial" w:eastAsia="Arial" w:hAnsi="Arial"/>
@@ -23328,7 +23328,7 @@
             <w:pPr>
               <w:spacing w:after="20" w:before="0"/>
             </w:pPr>
-            <w:hyperlink w:history="1" r:id="rIdzjbvnv_yw3mkmm6xe2jas">
+            <w:hyperlink w:history="1" r:id="rId1ydd5yxvzrv1_q9uaznsg">
               <w:r>
                 <w:rPr>
                   <w:rFonts w:ascii="Arial" w:cs="Arial" w:eastAsia="Arial" w:hAnsi="Arial"/>
@@ -23361,7 +23361,7 @@
               <w:spacing w:after="10" w:before="0"/>
               <w:ind w:left="120"/>
             </w:pPr>
-            <w:hyperlink w:history="1" r:id="rId0m1cknaewrku2g1qryhxy">
+            <w:hyperlink w:history="1" r:id="rIdkahggjyltptelfrx8n9ir">
               <w:r>
                 <w:rPr>
                   <w:rFonts w:ascii="Arial" w:cs="Arial" w:eastAsia="Arial" w:hAnsi="Arial"/>
@@ -23702,7 +23702,7 @@
             <w:pPr>
               <w:spacing w:after="20" w:before="0"/>
             </w:pPr>
-            <w:hyperlink w:history="1" r:id="rId1aezq0sif7e2pwbv_ayp6">
+            <w:hyperlink w:history="1" r:id="rIdd-brosckmzrbkds5c6u6r">
               <w:r>
                 <w:rPr>
                   <w:rFonts w:ascii="Arial" w:cs="Arial" w:eastAsia="Arial" w:hAnsi="Arial"/>
@@ -23735,7 +23735,7 @@
               <w:spacing w:after="10" w:before="0"/>
               <w:ind w:left="120"/>
             </w:pPr>
-            <w:hyperlink w:history="1" r:id="rIdzn8bq84ejr2kurvkjz3rz">
+            <w:hyperlink w:history="1" r:id="rIdulxwujxsheha6zc9csxo1">
               <w:r>
                 <w:rPr>
                   <w:rFonts w:ascii="Arial" w:cs="Arial" w:eastAsia="Arial" w:hAnsi="Arial"/>
@@ -23780,7 +23780,7 @@
             <w:pPr>
               <w:spacing w:after="20" w:before="0"/>
             </w:pPr>
-            <w:hyperlink w:history="1" r:id="rIddveqfmw8vcz5jbwwovm_j">
+            <w:hyperlink w:history="1" r:id="rIdi1xs7jjtamnsnrbvy-mja">
               <w:r>
                 <w:rPr>
                   <w:rFonts w:ascii="Arial" w:cs="Arial" w:eastAsia="Arial" w:hAnsi="Arial"/>
@@ -23813,7 +23813,7 @@
               <w:spacing w:after="10" w:before="0"/>
               <w:ind w:left="120"/>
             </w:pPr>
-            <w:hyperlink w:history="1" r:id="rIdf-ywd4vmadwws0ht15gnq">
+            <w:hyperlink w:history="1" r:id="rIdtrotcgjmjicot6na0qybh">
               <w:r>
                 <w:rPr>
                   <w:rFonts w:ascii="Arial" w:cs="Arial" w:eastAsia="Arial" w:hAnsi="Arial"/>
@@ -24097,7 +24097,7 @@
             <w:pPr>
               <w:spacing w:after="20" w:before="0"/>
             </w:pPr>
-            <w:hyperlink w:history="1" r:id="rIdawvz5iahexpm4scpso_jf">
+            <w:hyperlink w:history="1" r:id="rIdlfcpsctwzdx8u886t4ubr">
               <w:r>
                 <w:rPr>
                   <w:rFonts w:ascii="Arial" w:cs="Arial" w:eastAsia="Arial" w:hAnsi="Arial"/>
@@ -24130,7 +24130,7 @@
               <w:spacing w:after="10" w:before="0"/>
               <w:ind w:left="120"/>
             </w:pPr>
-            <w:hyperlink w:history="1" r:id="rIdiqveruth5zfny853ms8cd">
+            <w:hyperlink w:history="1" r:id="rIdpm9kbh0l0-rxi7pxuhysk">
               <w:r>
                 <w:rPr>
                   <w:rFonts w:ascii="Arial" w:cs="Arial" w:eastAsia="Arial" w:hAnsi="Arial"/>
@@ -24175,7 +24175,7 @@
             <w:pPr>
               <w:spacing w:after="20" w:before="0"/>
             </w:pPr>
-            <w:hyperlink w:history="1" r:id="rIdf2pd25fht3tnk7dhaohi1">
+            <w:hyperlink w:history="1" r:id="rIdcow2cy-mnyrohszwz0gqz">
               <w:r>
                 <w:rPr>
                   <w:rFonts w:ascii="Arial" w:cs="Arial" w:eastAsia="Arial" w:hAnsi="Arial"/>
@@ -24208,7 +24208,7 @@
               <w:spacing w:after="10" w:before="0"/>
               <w:ind w:left="120"/>
             </w:pPr>
-            <w:hyperlink w:history="1" r:id="rIdrguaqv3va7qbahopjvm1o">
+            <w:hyperlink w:history="1" r:id="rId9-ajdbzg3upgeyk9gnoy6">
               <w:r>
                 <w:rPr>
                   <w:rFonts w:ascii="Arial" w:cs="Arial" w:eastAsia="Arial" w:hAnsi="Arial"/>

</xml_diff>